<commit_message>
Swap SaaSpocalypse source from HumaI Blog to Bloomberg
Bloomberg's Feb 4, 2026 piece "What's Behind the 'SaaSpocalypse' Plunge
in Software Stocks" is the canonical financial-press source for the term;
HumaI Blog was a weaker secondary.

- Whitepaper note 12 and bibliography entry updated to Bloomberg
- Site: "SaaSpocalypse" mention in the market section now links to the
  Bloomberg article in a new tab
- Asset refreshed

Co-Authored-By: Claude Opus 4.7 <noreply@anthropic.com>
</commit_message>
<xml_diff>
--- a/forward-deployed-decade/assets/ISI.FDD.docx
+++ b/forward-deployed-decade/assets/ISI.FDD.docx
@@ -2953,7 +2953,7 @@
           <w:color w:val="1E1D1C"/>
           <w:sz w:val="20"/>
         </w:rPr>
-        <w:t>12. HumaI Blog, "SaaSpocalypse: Why Enterprise Software Has Lost More Than $2 Trillion in 2026," accessed May 15, 2026, https://www.humai.blog/saaspocalypse-why-enterprise-software-has-lost-more-than-2-trillion-in-2026/.</w:t>
+        <w:t>12. Bloomberg, "What's Behind the 'SaaSpocalypse' Plunge in Software Stocks," February 4, 2026, https://www.bloomberg.com/news/articles/2026-02-04/what-s-behind-the-saaspocalypse-plunge-in-software-stocks.</w:t>
       </w:r>
     </w:p>
     <w:p>
@@ -3105,17 +3105,13 @@
       <w:pPr>
         <w:spacing w:after="80"/>
         <w:ind w:left="360" w:hanging="360"/>
-        <w:rPr>
-          <w:rFonts w:hint="eastAsia"/>
-        </w:rPr>
-      </w:pPr>
-      <w:r>
-        <w:rPr>
-          <w:rFonts w:eastAsia="Open Sans" w:cs="Open Sans"/>
+      </w:pPr>
+      <w:r>
+        <w:rPr>
           <w:color w:val="1E1D1C"/>
           <w:sz w:val="20"/>
         </w:rPr>
-        <w:t>Cognizant. "Cognizant Adopts Anthropic's Claude to Accelerate Enterprise AI Adoption at Scale and Deploys Claude to Drive Internal AI Transformation." News release, November 4, 2025. https://news.cognizant.com/2025-11-04-Cognizant-Adopts-Anthropics-Claude-to-Accelerate-Enterprise-AI-Adoption-at-Scale-and-Deploys-Claude-to-Drive-Internal-AI-Transformation.</w:t>
+        <w:t>Bloomberg. "What's Behind the 'SaaSpocalypse' Plunge in Software Stocks." February 4, 2026. https://www.bloomberg.com/news/articles/2026-02-04/what-s-behind-the-saaspocalypse-plunge-in-software-stocks.</w:t>
       </w:r>
     </w:p>
     <w:p>
@@ -3132,7 +3128,7 @@
           <w:color w:val="1E1D1C"/>
           <w:sz w:val="20"/>
         </w:rPr>
-        <w:t>Data Consulting Insights. "AI Consulting Pricing: What GenAI Projects Actually Cost in 2026." Accessed May 14, 2026. https://dataconsultingfirms.com/insights/ai-consulting-pricing.</w:t>
+        <w:t>Cognizant. "Cognizant Adopts Anthropic's Claude to Accelerate Enterprise AI Adoption at Scale and Deploys Claude to Drive Internal AI Transformation." News release, November 4, 2025. https://news.cognizant.com/2025-11-04-Cognizant-Adopts-Anthropics-Claude-to-Accelerate-Enterprise-AI-Adoption-at-Scale-and-Deploys-Claude-to-Drive-Internal-AI-Transformation.</w:t>
       </w:r>
     </w:p>
     <w:p>
@@ -3149,37 +3145,37 @@
           <w:color w:val="1E1D1C"/>
           <w:sz w:val="20"/>
         </w:rPr>
-        <w:t>Ford, Brody, and Shirin Ghaffary. "OpenAI Acquires Tomoro to Boost Private Equity-Backed AI Venture." Bloomberg, May 11, 2026. https://www.bloomberg.com/news/articles/2026-05-11/openai-to-buy-consulting-firm-for-private-equity-joint-venture.</w:t>
+        <w:t>Data Consulting Insights. "AI Consulting Pricing: What GenAI Projects Actually Cost in 2026." Accessed May 14, 2026. https://dataconsultingfirms.com/insights/ai-consulting-pricing.</w:t>
       </w:r>
     </w:p>
     <w:p>
       <w:pPr>
         <w:spacing w:after="80"/>
         <w:ind w:left="360" w:hanging="360"/>
-      </w:pPr>
-      <w:r>
-        <w:rPr>
+        <w:rPr>
+          <w:rFonts w:hint="eastAsia"/>
+        </w:rPr>
+      </w:pPr>
+      <w:r>
+        <w:rPr>
+          <w:rFonts w:eastAsia="Open Sans" w:cs="Open Sans"/>
           <w:color w:val="1E1D1C"/>
           <w:sz w:val="20"/>
         </w:rPr>
-        <w:t>Fortune. "MIT Report: 95% of Generative AI Pilots at Companies Are Failing." August 18, 2025. https://fortune.com/2025/08/18/mit-report-95-percent-generative-ai-pilots-at-companies-failing-cfo/.</w:t>
+        <w:t>Ford, Brody, and Shirin Ghaffary. "OpenAI Acquires Tomoro to Boost Private Equity-Backed AI Venture." Bloomberg, May 11, 2026. https://www.bloomberg.com/news/articles/2026-05-11/openai-to-buy-consulting-firm-for-private-equity-joint-venture.</w:t>
       </w:r>
     </w:p>
     <w:p>
       <w:pPr>
         <w:spacing w:after="80"/>
         <w:ind w:left="360" w:hanging="360"/>
-        <w:rPr>
-          <w:rFonts w:hint="eastAsia"/>
-        </w:rPr>
-      </w:pPr>
-      <w:r>
-        <w:rPr>
-          <w:rFonts w:eastAsia="Open Sans" w:cs="Open Sans"/>
+      </w:pPr>
+      <w:r>
+        <w:rPr>
           <w:color w:val="1E1D1C"/>
           <w:sz w:val="20"/>
         </w:rPr>
-        <w:t>Garfinkle, Allie. "Anthropic Takes Shot at Consulting Industry in Joint Venture with Wall Street Giants." Fortune, May 4, 2026. https://fortune.com/2026/05/04/anthropic-claude-consulting-industry-joint-venture-blackstone-goldman-sachs/.</w:t>
+        <w:t>Fortune. "MIT Report: 95% of Generative AI Pilots at Companies Are Failing." August 18, 2025. https://fortune.com/2025/08/18/mit-report-95-percent-generative-ai-pilots-at-companies-failing-cfo/.</w:t>
       </w:r>
     </w:p>
     <w:p>
@@ -3196,20 +3192,24 @@
           <w:color w:val="1E1D1C"/>
           <w:sz w:val="20"/>
         </w:rPr>
-        <w:t>Google Cloud. "Google Cloud Commits $750 Million to Accelerate Partners' Agentic AI Development." Press release, April 22, 2026. https://www.googlecloudpresscorner.com/2026-04-22-Google-Cloud-Commits-750-Million-to-Accelerate-Partners-Agentic-AI-Development.</w:t>
+        <w:t>Garfinkle, Allie. "Anthropic Takes Shot at Consulting Industry in Joint Venture with Wall Street Giants." Fortune, May 4, 2026. https://fortune.com/2026/05/04/anthropic-claude-consulting-industry-joint-venture-blackstone-goldman-sachs/.</w:t>
       </w:r>
     </w:p>
     <w:p>
       <w:pPr>
         <w:spacing w:after="80"/>
         <w:ind w:left="360" w:hanging="360"/>
-      </w:pPr>
-      <w:r>
-        <w:rPr>
+        <w:rPr>
+          <w:rFonts w:hint="eastAsia"/>
+        </w:rPr>
+      </w:pPr>
+      <w:r>
+        <w:rPr>
+          <w:rFonts w:eastAsia="Open Sans" w:cs="Open Sans"/>
           <w:color w:val="1E1D1C"/>
           <w:sz w:val="20"/>
         </w:rPr>
-        <w:t>HumaI Blog. "SaaSpocalypse: Why Enterprise Software Has Lost More Than $2 Trillion in 2026." Accessed May 15, 2026. https://www.humai.blog/saaspocalypse-why-enterprise-software-has-lost-more-than-2-trillion-in-2026/.</w:t>
+        <w:t>Google Cloud. "Google Cloud Commits $750 Million to Accelerate Partners' Agentic AI Development." Press release, April 22, 2026. https://www.googlecloudpresscorner.com/2026-04-22-Google-Cloud-Commits-750-Million-to-Accelerate-Partners-Agentic-AI-Development.</w:t>
       </w:r>
     </w:p>
     <w:p>

</xml_diff>

<commit_message>
Tighten docx pagination across headings and list paragraphs
- widowControl on all 149 paragraphs (kills single-line orphans/widows)
- keepNext + keepLines on all 53 Heading 1, Heading 2, and List Paragraph
  items so headings don't strand at the bottom of pages and Step 1/2/3
  bullets don't split across page breaks
- Existing page breaks on §1, §7, §11, §12 untouched

Co-Authored-By: Claude Opus 4.7 <noreply@anthropic.com>
</commit_message>
<xml_diff>
--- a/forward-deployed-decade/assets/ISI.FDD.docx
+++ b/forward-deployed-decade/assets/ISI.FDD.docx
@@ -8,6 +8,7 @@
         <w:rPr>
           <w:rFonts w:hint="eastAsia"/>
         </w:rPr>
+        <w:widowControl w:val="1"/>
       </w:pPr>
       <w:r>
         <w:rPr>
@@ -56,6 +57,7 @@
         <w:rPr>
           <w:rFonts w:hint="eastAsia"/>
         </w:rPr>
+        <w:widowControl w:val="1"/>
       </w:pPr>
       <w:r>
         <w:rPr>
@@ -73,6 +75,7 @@
         <w:rPr>
           <w:rFonts w:hint="eastAsia"/>
         </w:rPr>
+        <w:widowControl w:val="1"/>
       </w:pPr>
       <w:r>
         <w:rPr>
@@ -90,6 +93,7 @@
         <w:rPr>
           <w:rFonts w:hint="eastAsia"/>
         </w:rPr>
+        <w:widowControl w:val="1"/>
       </w:pPr>
       <w:r>
         <w:rPr>
@@ -107,6 +111,7 @@
         <w:rPr>
           <w:rFonts w:hint="eastAsia"/>
         </w:rPr>
+        <w:widowControl w:val="1"/>
       </w:pPr>
       <w:r>
         <w:rPr>
@@ -124,6 +129,7 @@
         <w:rPr>
           <w:rFonts w:hint="eastAsia"/>
         </w:rPr>
+        <w:widowControl w:val="1"/>
       </w:pPr>
       <w:r>
         <w:rPr>
@@ -140,6 +146,7 @@
         <w:rPr>
           <w:rFonts w:hint="eastAsia"/>
         </w:rPr>
+        <w:widowControl w:val="1"/>
       </w:pPr>
       <w:r>
         <w:rPr>
@@ -155,6 +162,7 @@
         <w:rPr>
           <w:rFonts w:hint="eastAsia"/>
         </w:rPr>
+        <w:widowControl w:val="1"/>
       </w:pPr>
       <w:r>
         <w:rPr>
@@ -170,6 +178,7 @@
         <w:rPr>
           <w:rFonts w:hint="eastAsia"/>
         </w:rPr>
+        <w:widowControl w:val="1"/>
       </w:pPr>
       <w:r>
         <w:rPr>
@@ -186,6 +195,7 @@
         <w:rPr>
           <w:rFonts w:hint="eastAsia"/>
         </w:rPr>
+        <w:widowControl w:val="1"/>
       </w:pPr>
       <w:r>
         <w:rPr>
@@ -201,6 +211,7 @@
         <w:rPr>
           <w:rFonts w:hint="eastAsia"/>
         </w:rPr>
+        <w:widowControl w:val="1"/>
       </w:pPr>
       <w:r>
         <w:rPr>
@@ -231,6 +242,7 @@
         <w:rPr>
           <w:rFonts w:hint="eastAsia"/>
         </w:rPr>
+        <w:widowControl w:val="1"/>
       </w:pPr>
       <w:r>
         <w:rPr>
@@ -253,6 +265,9 @@
         <w:pStyle w:val="Heading1"/>
         <w:pageBreakBefore/>
         <w:spacing w:before="360" w:after="160"/>
+        <w:widowControl w:val="1"/>
+        <w:keepNext w:val="1"/>
+        <w:keepLines w:val="1"/>
       </w:pPr>
       <w:r>
         <w:rPr>
@@ -270,6 +285,7 @@
         <w:rPr>
           <w:rFonts w:hint="eastAsia"/>
         </w:rPr>
+        <w:widowControl w:val="1"/>
       </w:pPr>
       <w:r>
         <w:rPr>
@@ -283,6 +299,9 @@
       <w:pPr>
         <w:pStyle w:val="Heading2"/>
         <w:spacing w:before="240" w:after="80"/>
+        <w:widowControl w:val="1"/>
+        <w:keepNext w:val="1"/>
+        <w:keepLines w:val="1"/>
       </w:pPr>
       <w:r>
         <w:rPr>
@@ -298,6 +317,7 @@
         <w:rPr>
           <w:rFonts w:hint="eastAsia"/>
         </w:rPr>
+        <w:widowControl w:val="1"/>
       </w:pPr>
       <w:r>
         <w:rPr>
@@ -334,6 +354,9 @@
       <w:pPr>
         <w:pStyle w:val="Heading2"/>
         <w:spacing w:before="240" w:after="80"/>
+        <w:widowControl w:val="1"/>
+        <w:keepNext w:val="1"/>
+        <w:keepLines w:val="1"/>
       </w:pPr>
       <w:r>
         <w:rPr>
@@ -349,6 +372,7 @@
         <w:rPr>
           <w:rFonts w:hint="eastAsia"/>
         </w:rPr>
+        <w:widowControl w:val="1"/>
       </w:pPr>
       <w:r>
         <w:rPr>
@@ -377,6 +401,9 @@
       <w:pPr>
         <w:pStyle w:val="Heading2"/>
         <w:spacing w:before="240" w:after="80"/>
+        <w:widowControl w:val="1"/>
+        <w:keepNext w:val="1"/>
+        <w:keepLines w:val="1"/>
       </w:pPr>
       <w:r>
         <w:rPr>
@@ -392,6 +419,7 @@
         <w:rPr>
           <w:rFonts w:hint="eastAsia"/>
         </w:rPr>
+        <w:widowControl w:val="1"/>
       </w:pPr>
       <w:r>
         <w:rPr>
@@ -428,6 +456,9 @@
       <w:pPr>
         <w:pStyle w:val="Heading2"/>
         <w:spacing w:before="240" w:after="80"/>
+        <w:widowControl w:val="1"/>
+        <w:keepNext w:val="1"/>
+        <w:keepLines w:val="1"/>
       </w:pPr>
       <w:r>
         <w:rPr>
@@ -443,6 +474,7 @@
         <w:rPr>
           <w:rFonts w:hint="eastAsia"/>
         </w:rPr>
+        <w:widowControl w:val="1"/>
       </w:pPr>
       <w:r>
         <w:rPr>
@@ -479,6 +511,9 @@
       <w:pPr>
         <w:pStyle w:val="Heading1"/>
         <w:spacing w:before="360" w:after="160"/>
+        <w:widowControl w:val="1"/>
+        <w:keepNext w:val="1"/>
+        <w:keepLines w:val="1"/>
       </w:pPr>
       <w:r>
         <w:rPr>
@@ -493,6 +528,9 @@
       <w:pPr>
         <w:pStyle w:val="Heading2"/>
         <w:spacing w:before="240" w:after="80"/>
+        <w:widowControl w:val="1"/>
+        <w:keepNext w:val="1"/>
+        <w:keepLines w:val="1"/>
       </w:pPr>
       <w:r>
         <w:rPr>
@@ -508,6 +546,7 @@
         <w:rPr>
           <w:rFonts w:hint="eastAsia"/>
         </w:rPr>
+        <w:widowControl w:val="1"/>
       </w:pPr>
       <w:r>
         <w:rPr>
@@ -521,6 +560,9 @@
       <w:pPr>
         <w:pStyle w:val="Heading2"/>
         <w:spacing w:before="240" w:after="80"/>
+        <w:widowControl w:val="1"/>
+        <w:keepNext w:val="1"/>
+        <w:keepLines w:val="1"/>
       </w:pPr>
       <w:r>
         <w:rPr>
@@ -536,6 +578,7 @@
         <w:rPr>
           <w:rFonts w:hint="eastAsia"/>
         </w:rPr>
+        <w:widowControl w:val="1"/>
       </w:pPr>
       <w:r>
         <w:rPr>
@@ -564,6 +607,9 @@
       <w:pPr>
         <w:pStyle w:val="Heading2"/>
         <w:spacing w:before="240" w:after="80"/>
+        <w:widowControl w:val="1"/>
+        <w:keepNext w:val="1"/>
+        <w:keepLines w:val="1"/>
       </w:pPr>
       <w:r>
         <w:rPr>
@@ -579,6 +625,7 @@
         <w:rPr>
           <w:rFonts w:hint="eastAsia"/>
         </w:rPr>
+        <w:widowControl w:val="1"/>
       </w:pPr>
       <w:r>
         <w:rPr>
@@ -592,6 +639,9 @@
       <w:pPr>
         <w:pStyle w:val="Heading1"/>
         <w:spacing w:before="360" w:after="160"/>
+        <w:widowControl w:val="1"/>
+        <w:keepNext w:val="1"/>
+        <w:keepLines w:val="1"/>
       </w:pPr>
       <w:r>
         <w:rPr>
@@ -607,6 +657,9 @@
       <w:pPr>
         <w:pStyle w:val="Heading2"/>
         <w:spacing w:before="240" w:after="80"/>
+        <w:widowControl w:val="1"/>
+        <w:keepNext w:val="1"/>
+        <w:keepLines w:val="1"/>
       </w:pPr>
       <w:r>
         <w:rPr>
@@ -622,6 +675,7 @@
         <w:rPr>
           <w:rFonts w:hint="eastAsia"/>
         </w:rPr>
+        <w:widowControl w:val="1"/>
       </w:pPr>
       <w:r>
         <w:rPr>
@@ -654,6 +708,9 @@
       <w:pPr>
         <w:pStyle w:val="Heading2"/>
         <w:spacing w:before="240" w:after="80"/>
+        <w:widowControl w:val="1"/>
+        <w:keepNext w:val="1"/>
+        <w:keepLines w:val="1"/>
       </w:pPr>
       <w:r>
         <w:rPr>
@@ -669,6 +726,7 @@
         <w:rPr>
           <w:rFonts w:hint="eastAsia"/>
         </w:rPr>
+        <w:widowControl w:val="1"/>
       </w:pPr>
       <w:r>
         <w:rPr>
@@ -682,6 +740,9 @@
       <w:pPr>
         <w:pStyle w:val="Heading2"/>
         <w:spacing w:before="240" w:after="80"/>
+        <w:widowControl w:val="1"/>
+        <w:keepNext w:val="1"/>
+        <w:keepLines w:val="1"/>
       </w:pPr>
       <w:r>
         <w:rPr>
@@ -697,6 +758,7 @@
         <w:rPr>
           <w:rFonts w:hint="eastAsia"/>
         </w:rPr>
+        <w:widowControl w:val="1"/>
       </w:pPr>
       <w:r>
         <w:rPr>
@@ -725,6 +787,9 @@
       <w:pPr>
         <w:pStyle w:val="Heading2"/>
         <w:spacing w:before="240" w:after="80"/>
+        <w:widowControl w:val="1"/>
+        <w:keepNext w:val="1"/>
+        <w:keepLines w:val="1"/>
       </w:pPr>
       <w:r>
         <w:rPr>
@@ -740,6 +805,7 @@
         <w:rPr>
           <w:rFonts w:hint="eastAsia"/>
         </w:rPr>
+        <w:widowControl w:val="1"/>
       </w:pPr>
       <w:r>
         <w:rPr>
@@ -761,6 +827,9 @@
       <w:pPr>
         <w:pStyle w:val="Heading2"/>
         <w:spacing w:before="240" w:after="80"/>
+        <w:widowControl w:val="1"/>
+        <w:keepNext w:val="1"/>
+        <w:keepLines w:val="1"/>
       </w:pPr>
       <w:r>
         <w:rPr>
@@ -773,6 +842,7 @@
     <w:p>
       <w:pPr>
         <w:spacing w:after="120"/>
+        <w:widowControl w:val="1"/>
       </w:pPr>
       <w:r>
         <w:rPr>
@@ -824,6 +894,9 @@
       <w:pPr>
         <w:pStyle w:val="Heading1"/>
         <w:spacing w:before="360" w:after="160"/>
+        <w:widowControl w:val="1"/>
+        <w:keepNext w:val="1"/>
+        <w:keepLines w:val="1"/>
       </w:pPr>
       <w:r>
         <w:rPr>
@@ -840,6 +913,7 @@
         <w:rPr>
           <w:rFonts w:hint="eastAsia"/>
         </w:rPr>
+        <w:widowControl w:val="1"/>
       </w:pPr>
       <w:r>
         <w:rPr>
@@ -853,6 +927,9 @@
       <w:pPr>
         <w:pStyle w:val="Heading2"/>
         <w:spacing w:before="240" w:after="80"/>
+        <w:widowControl w:val="1"/>
+        <w:keepNext w:val="1"/>
+        <w:keepLines w:val="1"/>
       </w:pPr>
       <w:r>
         <w:rPr>
@@ -868,6 +945,7 @@
         <w:rPr>
           <w:rFonts w:hint="eastAsia"/>
         </w:rPr>
+        <w:widowControl w:val="1"/>
       </w:pPr>
       <w:r>
         <w:rPr>
@@ -881,6 +959,9 @@
       <w:pPr>
         <w:pStyle w:val="Heading2"/>
         <w:spacing w:before="240" w:after="80"/>
+        <w:widowControl w:val="1"/>
+        <w:keepNext w:val="1"/>
+        <w:keepLines w:val="1"/>
       </w:pPr>
       <w:r>
         <w:rPr>
@@ -896,6 +977,7 @@
         <w:rPr>
           <w:rFonts w:hint="eastAsia"/>
         </w:rPr>
+        <w:widowControl w:val="1"/>
       </w:pPr>
       <w:r>
         <w:rPr>
@@ -917,6 +999,9 @@
       <w:pPr>
         <w:pStyle w:val="Heading2"/>
         <w:spacing w:before="240" w:after="80"/>
+        <w:widowControl w:val="1"/>
+        <w:keepNext w:val="1"/>
+        <w:keepLines w:val="1"/>
       </w:pPr>
       <w:r>
         <w:rPr>
@@ -932,6 +1017,7 @@
         <w:rPr>
           <w:rFonts w:hint="eastAsia"/>
         </w:rPr>
+        <w:widowControl w:val="1"/>
       </w:pPr>
       <w:r>
         <w:rPr>
@@ -945,6 +1031,9 @@
       <w:pPr>
         <w:pStyle w:val="Heading2"/>
         <w:spacing w:before="240" w:after="80"/>
+        <w:widowControl w:val="1"/>
+        <w:keepNext w:val="1"/>
+        <w:keepLines w:val="1"/>
       </w:pPr>
       <w:r>
         <w:rPr>
@@ -960,6 +1049,7 @@
         <w:rPr>
           <w:rFonts w:hint="eastAsia"/>
         </w:rPr>
+        <w:widowControl w:val="1"/>
       </w:pPr>
       <w:r>
         <w:rPr>
@@ -981,6 +1071,9 @@
       <w:pPr>
         <w:pStyle w:val="Heading2"/>
         <w:spacing w:before="240" w:after="80"/>
+        <w:widowControl w:val="1"/>
+        <w:keepNext w:val="1"/>
+        <w:keepLines w:val="1"/>
       </w:pPr>
       <w:r>
         <w:rPr>
@@ -996,6 +1089,7 @@
         <w:rPr>
           <w:rFonts w:hint="eastAsia"/>
         </w:rPr>
+        <w:widowControl w:val="1"/>
       </w:pPr>
       <w:r>
         <w:rPr>
@@ -1011,6 +1105,7 @@
         <w:rPr>
           <w:rFonts w:hint="eastAsia"/>
         </w:rPr>
+        <w:widowControl w:val="1"/>
       </w:pPr>
       <w:r>
         <w:rPr>
@@ -1024,6 +1119,9 @@
       <w:pPr>
         <w:pStyle w:val="Heading2"/>
         <w:spacing w:before="240" w:after="80"/>
+        <w:widowControl w:val="1"/>
+        <w:keepNext w:val="1"/>
+        <w:keepLines w:val="1"/>
       </w:pPr>
       <w:r>
         <w:rPr>
@@ -1039,6 +1137,7 @@
         <w:rPr>
           <w:rFonts w:hint="eastAsia"/>
         </w:rPr>
+        <w:widowControl w:val="1"/>
       </w:pPr>
       <w:r>
         <w:rPr>
@@ -1062,6 +1161,7 @@
         <w:rPr>
           <w:rFonts w:hint="eastAsia"/>
         </w:rPr>
+        <w:widowControl w:val="1"/>
       </w:pPr>
       <w:r>
         <w:rPr>
@@ -1075,6 +1175,9 @@
       <w:pPr>
         <w:pStyle w:val="Heading1"/>
         <w:spacing w:before="360" w:after="160"/>
+        <w:widowControl w:val="1"/>
+        <w:keepNext w:val="1"/>
+        <w:keepLines w:val="1"/>
       </w:pPr>
       <w:r>
         <w:rPr>
@@ -1089,6 +1192,9 @@
       <w:pPr>
         <w:pStyle w:val="Heading2"/>
         <w:spacing w:before="240" w:after="80"/>
+        <w:widowControl w:val="1"/>
+        <w:keepNext w:val="1"/>
+        <w:keepLines w:val="1"/>
       </w:pPr>
       <w:r>
         <w:rPr>
@@ -1104,6 +1210,7 @@
         <w:rPr>
           <w:rFonts w:hint="eastAsia"/>
         </w:rPr>
+        <w:widowControl w:val="1"/>
       </w:pPr>
       <w:r>
         <w:rPr>
@@ -1132,6 +1239,9 @@
       <w:pPr>
         <w:pStyle w:val="Heading2"/>
         <w:spacing w:before="240" w:after="80"/>
+        <w:widowControl w:val="1"/>
+        <w:keepNext w:val="1"/>
+        <w:keepLines w:val="1"/>
       </w:pPr>
       <w:r>
         <w:rPr>
@@ -1147,6 +1257,7 @@
         <w:rPr>
           <w:rFonts w:hint="eastAsia"/>
         </w:rPr>
+        <w:widowControl w:val="1"/>
       </w:pPr>
       <w:r>
         <w:rPr>
@@ -1160,6 +1271,9 @@
       <w:pPr>
         <w:pStyle w:val="Heading2"/>
         <w:spacing w:before="240" w:after="80"/>
+        <w:widowControl w:val="1"/>
+        <w:keepNext w:val="1"/>
+        <w:keepLines w:val="1"/>
       </w:pPr>
       <w:r>
         <w:rPr>
@@ -1176,6 +1290,7 @@
         <w:rPr>
           <w:rFonts w:hint="eastAsia"/>
         </w:rPr>
+        <w:widowControl w:val="1"/>
       </w:pPr>
       <w:r>
         <w:rPr>
@@ -1189,6 +1304,9 @@
       <w:pPr>
         <w:pStyle w:val="Heading2"/>
         <w:spacing w:before="240" w:after="80"/>
+        <w:widowControl w:val="1"/>
+        <w:keepNext w:val="1"/>
+        <w:keepLines w:val="1"/>
       </w:pPr>
       <w:r>
         <w:rPr>
@@ -1204,6 +1322,7 @@
         <w:rPr>
           <w:rFonts w:hint="eastAsia"/>
         </w:rPr>
+        <w:widowControl w:val="1"/>
       </w:pPr>
       <w:r>
         <w:rPr>
@@ -1217,6 +1336,9 @@
       <w:pPr>
         <w:pStyle w:val="Heading2"/>
         <w:spacing w:before="240" w:after="80"/>
+        <w:widowControl w:val="1"/>
+        <w:keepNext w:val="1"/>
+        <w:keepLines w:val="1"/>
       </w:pPr>
       <w:r>
         <w:rPr>
@@ -1232,6 +1354,7 @@
         <w:rPr>
           <w:rFonts w:hint="eastAsia"/>
         </w:rPr>
+        <w:widowControl w:val="1"/>
       </w:pPr>
       <w:r>
         <w:rPr>
@@ -1245,6 +1368,9 @@
       <w:pPr>
         <w:pStyle w:val="Heading1"/>
         <w:spacing w:before="360" w:after="160"/>
+        <w:widowControl w:val="1"/>
+        <w:keepNext w:val="1"/>
+        <w:keepLines w:val="1"/>
       </w:pPr>
       <w:r>
         <w:rPr>
@@ -1259,6 +1385,9 @@
       <w:pPr>
         <w:pStyle w:val="Heading2"/>
         <w:spacing w:before="240" w:after="80"/>
+        <w:widowControl w:val="1"/>
+        <w:keepNext w:val="1"/>
+        <w:keepLines w:val="1"/>
       </w:pPr>
       <w:r>
         <w:rPr>
@@ -1274,6 +1403,7 @@
         <w:rPr>
           <w:rFonts w:hint="eastAsia"/>
         </w:rPr>
+        <w:widowControl w:val="1"/>
       </w:pPr>
       <w:r>
         <w:rPr>
@@ -1295,6 +1425,9 @@
       <w:pPr>
         <w:pStyle w:val="Heading2"/>
         <w:spacing w:before="240" w:after="80"/>
+        <w:widowControl w:val="1"/>
+        <w:keepNext w:val="1"/>
+        <w:keepLines w:val="1"/>
       </w:pPr>
       <w:r>
         <w:rPr>
@@ -1307,11 +1440,13 @@
     <w:p>
       <w:pPr>
         <w:pStyle w:val="ListParagraph"/>
-        <w:keepLines/>
+        <w:keepLines w:val="1"/>
         <w:spacing w:after="80"/>
         <w:rPr>
           <w:rFonts w:hint="eastAsia"/>
         </w:rPr>
+        <w:widowControl w:val="1"/>
+        <w:keepNext w:val="1"/>
       </w:pPr>
       <w:r>
         <w:rPr>
@@ -1324,11 +1459,13 @@
     <w:p>
       <w:pPr>
         <w:pStyle w:val="ListParagraph"/>
-        <w:keepLines/>
+        <w:keepLines w:val="1"/>
         <w:spacing w:after="80"/>
         <w:rPr>
           <w:rFonts w:hint="eastAsia"/>
         </w:rPr>
+        <w:widowControl w:val="1"/>
+        <w:keepNext w:val="1"/>
       </w:pPr>
       <w:r>
         <w:rPr>
@@ -1341,11 +1478,13 @@
     <w:p>
       <w:pPr>
         <w:pStyle w:val="ListParagraph"/>
-        <w:keepLines/>
+        <w:keepLines w:val="1"/>
         <w:spacing w:after="80"/>
         <w:rPr>
           <w:rFonts w:hint="eastAsia"/>
         </w:rPr>
+        <w:widowControl w:val="1"/>
+        <w:keepNext w:val="1"/>
       </w:pPr>
       <w:r>
         <w:rPr>
@@ -1358,11 +1497,13 @@
     <w:p>
       <w:pPr>
         <w:pStyle w:val="ListParagraph"/>
-        <w:keepLines/>
+        <w:keepLines w:val="1"/>
         <w:spacing w:after="80"/>
         <w:rPr>
           <w:rFonts w:hint="eastAsia"/>
         </w:rPr>
+        <w:widowControl w:val="1"/>
+        <w:keepNext w:val="1"/>
       </w:pPr>
       <w:r>
         <w:rPr>
@@ -1375,11 +1516,13 @@
     <w:p>
       <w:pPr>
         <w:pStyle w:val="ListParagraph"/>
-        <w:keepLines/>
+        <w:keepLines w:val="1"/>
         <w:spacing w:after="80"/>
         <w:rPr>
           <w:rFonts w:hint="eastAsia"/>
         </w:rPr>
+        <w:widowControl w:val="1"/>
+        <w:keepNext w:val="1"/>
       </w:pPr>
       <w:r>
         <w:rPr>
@@ -1394,6 +1537,9 @@
       <w:pPr>
         <w:pStyle w:val="Heading2"/>
         <w:spacing w:before="240" w:after="80"/>
+        <w:widowControl w:val="1"/>
+        <w:keepNext w:val="1"/>
+        <w:keepLines w:val="1"/>
       </w:pPr>
       <w:r>
         <w:rPr>
@@ -1409,6 +1555,7 @@
         <w:rPr>
           <w:rFonts w:hint="eastAsia"/>
         </w:rPr>
+        <w:widowControl w:val="1"/>
       </w:pPr>
       <w:r>
         <w:rPr>
@@ -1452,6 +1599,9 @@
       <w:pPr>
         <w:pStyle w:val="Heading2"/>
         <w:spacing w:before="240" w:after="80"/>
+        <w:widowControl w:val="1"/>
+        <w:keepNext w:val="1"/>
+        <w:keepLines w:val="1"/>
       </w:pPr>
       <w:r>
         <w:rPr>
@@ -1467,6 +1617,7 @@
         <w:rPr>
           <w:rFonts w:hint="eastAsia"/>
         </w:rPr>
+        <w:widowControl w:val="1"/>
       </w:pPr>
       <w:r>
         <w:rPr>
@@ -1481,6 +1632,9 @@
         <w:pStyle w:val="Heading1"/>
         <w:pageBreakBefore/>
         <w:spacing w:before="360" w:after="160"/>
+        <w:widowControl w:val="1"/>
+        <w:keepNext w:val="1"/>
+        <w:keepLines w:val="1"/>
       </w:pPr>
       <w:r>
         <w:rPr>
@@ -1497,6 +1651,7 @@
         <w:rPr>
           <w:rFonts w:hint="eastAsia"/>
         </w:rPr>
+        <w:widowControl w:val="1"/>
       </w:pPr>
       <w:r>
         <w:rPr>
@@ -1537,6 +1692,7 @@
               <w:rPr>
                 <w:rFonts w:hint="eastAsia"/>
               </w:rPr>
+              <w:widowControl w:val="1"/>
             </w:pPr>
             <w:r>
               <w:rPr>
@@ -1554,6 +1710,7 @@
               <w:rPr>
                 <w:rFonts w:hint="eastAsia"/>
               </w:rPr>
+              <w:widowControl w:val="1"/>
             </w:pPr>
             <w:r>
               <w:rPr>
@@ -1580,6 +1737,7 @@
               <w:rPr>
                 <w:rFonts w:hint="eastAsia"/>
               </w:rPr>
+              <w:widowControl w:val="1"/>
             </w:pPr>
             <w:r>
               <w:rPr>
@@ -1606,6 +1764,7 @@
               <w:rPr>
                 <w:rFonts w:hint="eastAsia"/>
               </w:rPr>
+              <w:widowControl w:val="1"/>
             </w:pPr>
             <w:r>
               <w:rPr>
@@ -1632,6 +1791,7 @@
               <w:rPr>
                 <w:rFonts w:hint="eastAsia"/>
               </w:rPr>
+              <w:widowControl w:val="1"/>
             </w:pPr>
             <w:r>
               <w:rPr>
@@ -1658,6 +1818,7 @@
               <w:rPr>
                 <w:rFonts w:hint="eastAsia"/>
               </w:rPr>
+              <w:widowControl w:val="1"/>
             </w:pPr>
             <w:r>
               <w:rPr>
@@ -1684,6 +1845,7 @@
               <w:rPr>
                 <w:rFonts w:hint="eastAsia"/>
               </w:rPr>
+              <w:widowControl w:val="1"/>
             </w:pPr>
             <w:r>
               <w:rPr>
@@ -1720,6 +1882,7 @@
               <w:rPr>
                 <w:rFonts w:hint="eastAsia"/>
               </w:rPr>
+              <w:widowControl w:val="1"/>
             </w:pPr>
             <w:r>
               <w:rPr>
@@ -1737,6 +1900,7 @@
               <w:rPr>
                 <w:rFonts w:hint="eastAsia"/>
               </w:rPr>
+              <w:widowControl w:val="1"/>
             </w:pPr>
             <w:r>
               <w:rPr>
@@ -1763,6 +1927,7 @@
               <w:rPr>
                 <w:rFonts w:hint="eastAsia"/>
               </w:rPr>
+              <w:widowControl w:val="1"/>
             </w:pPr>
             <w:r>
               <w:rPr>
@@ -1789,6 +1954,7 @@
               <w:rPr>
                 <w:rFonts w:hint="eastAsia"/>
               </w:rPr>
+              <w:widowControl w:val="1"/>
             </w:pPr>
             <w:r>
               <w:rPr>
@@ -1815,6 +1981,7 @@
               <w:rPr>
                 <w:rFonts w:hint="eastAsia"/>
               </w:rPr>
+              <w:widowControl w:val="1"/>
             </w:pPr>
             <w:r>
               <w:rPr>
@@ -1841,6 +2008,7 @@
               <w:rPr>
                 <w:rFonts w:hint="eastAsia"/>
               </w:rPr>
+              <w:widowControl w:val="1"/>
             </w:pPr>
             <w:r>
               <w:rPr>
@@ -1882,6 +2050,7 @@
               <w:rPr>
                 <w:rFonts w:hint="eastAsia"/>
               </w:rPr>
+              <w:widowControl w:val="1"/>
             </w:pPr>
             <w:r>
               <w:rPr>
@@ -1899,6 +2068,7 @@
               <w:rPr>
                 <w:rFonts w:hint="eastAsia"/>
               </w:rPr>
+              <w:widowControl w:val="1"/>
             </w:pPr>
             <w:r>
               <w:rPr>
@@ -1925,6 +2095,7 @@
               <w:rPr>
                 <w:rFonts w:hint="eastAsia"/>
               </w:rPr>
+              <w:widowControl w:val="1"/>
             </w:pPr>
             <w:r>
               <w:rPr>
@@ -1951,6 +2122,7 @@
               <w:rPr>
                 <w:rFonts w:hint="eastAsia"/>
               </w:rPr>
+              <w:widowControl w:val="1"/>
             </w:pPr>
             <w:r>
               <w:rPr>
@@ -1977,6 +2149,7 @@
               <w:rPr>
                 <w:rFonts w:hint="eastAsia"/>
               </w:rPr>
+              <w:widowControl w:val="1"/>
             </w:pPr>
             <w:r>
               <w:rPr>
@@ -2003,6 +2176,7 @@
               <w:rPr>
                 <w:rFonts w:hint="eastAsia"/>
               </w:rPr>
+              <w:widowControl w:val="1"/>
             </w:pPr>
             <w:r>
               <w:rPr>
@@ -2040,6 +2214,7 @@
               <w:rPr>
                 <w:rFonts w:hint="eastAsia"/>
               </w:rPr>
+              <w:widowControl w:val="1"/>
             </w:pPr>
             <w:r>
               <w:rPr>
@@ -2058,6 +2233,7 @@
               <w:rPr>
                 <w:rFonts w:hint="eastAsia"/>
               </w:rPr>
+              <w:widowControl w:val="1"/>
             </w:pPr>
             <w:r>
               <w:rPr>
@@ -2084,6 +2260,7 @@
               <w:rPr>
                 <w:rFonts w:hint="eastAsia"/>
               </w:rPr>
+              <w:widowControl w:val="1"/>
             </w:pPr>
             <w:r>
               <w:rPr>
@@ -2110,6 +2287,7 @@
               <w:rPr>
                 <w:rFonts w:hint="eastAsia"/>
               </w:rPr>
+              <w:widowControl w:val="1"/>
             </w:pPr>
             <w:r>
               <w:rPr>
@@ -2136,6 +2314,7 @@
               <w:rPr>
                 <w:rFonts w:hint="eastAsia"/>
               </w:rPr>
+              <w:widowControl w:val="1"/>
             </w:pPr>
             <w:r>
               <w:rPr>
@@ -2171,6 +2350,7 @@
               <w:rPr>
                 <w:rFonts w:hint="eastAsia"/>
               </w:rPr>
+              <w:widowControl w:val="1"/>
             </w:pPr>
             <w:r>
               <w:rPr>
@@ -2197,6 +2377,7 @@
               <w:rPr>
                 <w:rFonts w:hint="eastAsia"/>
               </w:rPr>
+              <w:widowControl w:val="1"/>
             </w:pPr>
             <w:r>
               <w:rPr>
@@ -2215,12 +2396,16 @@
         <w:rPr>
           <w:rFonts w:hint="eastAsia"/>
         </w:rPr>
+        <w:widowControl w:val="1"/>
       </w:pPr>
     </w:p>
     <w:p>
       <w:pPr>
         <w:pStyle w:val="Heading1"/>
         <w:spacing w:before="360" w:after="160"/>
+        <w:widowControl w:val="1"/>
+        <w:keepNext w:val="1"/>
+        <w:keepLines w:val="1"/>
       </w:pPr>
       <w:r>
         <w:rPr>
@@ -2235,6 +2420,9 @@
       <w:pPr>
         <w:pStyle w:val="Heading2"/>
         <w:spacing w:before="240" w:after="80"/>
+        <w:widowControl w:val="1"/>
+        <w:keepNext w:val="1"/>
+        <w:keepLines w:val="1"/>
       </w:pPr>
       <w:r>
         <w:rPr>
@@ -2250,6 +2438,7 @@
         <w:rPr>
           <w:rFonts w:hint="eastAsia"/>
         </w:rPr>
+        <w:widowControl w:val="1"/>
       </w:pPr>
       <w:r>
         <w:rPr>
@@ -2263,6 +2452,9 @@
       <w:pPr>
         <w:pStyle w:val="Heading2"/>
         <w:spacing w:before="240" w:after="80"/>
+        <w:widowControl w:val="1"/>
+        <w:keepNext w:val="1"/>
+        <w:keepLines w:val="1"/>
       </w:pPr>
       <w:r>
         <w:rPr>
@@ -2278,6 +2470,7 @@
         <w:rPr>
           <w:rFonts w:hint="eastAsia"/>
         </w:rPr>
+        <w:widowControl w:val="1"/>
       </w:pPr>
       <w:r>
         <w:rPr>
@@ -2291,6 +2484,9 @@
       <w:pPr>
         <w:pStyle w:val="Heading2"/>
         <w:spacing w:before="240" w:after="80"/>
+        <w:widowControl w:val="1"/>
+        <w:keepNext w:val="1"/>
+        <w:keepLines w:val="1"/>
       </w:pPr>
       <w:r>
         <w:rPr>
@@ -2306,6 +2502,7 @@
         <w:rPr>
           <w:rFonts w:hint="eastAsia"/>
         </w:rPr>
+        <w:widowControl w:val="1"/>
       </w:pPr>
       <w:r>
         <w:rPr>
@@ -2319,6 +2516,9 @@
       <w:pPr>
         <w:pStyle w:val="Heading2"/>
         <w:spacing w:before="240" w:after="80"/>
+        <w:widowControl w:val="1"/>
+        <w:keepNext w:val="1"/>
+        <w:keepLines w:val="1"/>
       </w:pPr>
       <w:r>
         <w:rPr>
@@ -2334,6 +2534,7 @@
         <w:rPr>
           <w:rFonts w:hint="eastAsia"/>
         </w:rPr>
+        <w:widowControl w:val="1"/>
       </w:pPr>
       <w:r>
         <w:rPr>
@@ -2355,6 +2556,9 @@
       <w:pPr>
         <w:pStyle w:val="Heading2"/>
         <w:spacing w:before="240" w:after="80"/>
+        <w:widowControl w:val="1"/>
+        <w:keepNext w:val="1"/>
+        <w:keepLines w:val="1"/>
       </w:pPr>
       <w:r>
         <w:rPr>
@@ -2370,6 +2574,7 @@
         <w:rPr>
           <w:rFonts w:hint="eastAsia"/>
         </w:rPr>
+        <w:widowControl w:val="1"/>
       </w:pPr>
       <w:r>
         <w:rPr>
@@ -2383,6 +2588,9 @@
       <w:pPr>
         <w:pStyle w:val="Heading2"/>
         <w:spacing w:before="240" w:after="80"/>
+        <w:widowControl w:val="1"/>
+        <w:keepNext w:val="1"/>
+        <w:keepLines w:val="1"/>
       </w:pPr>
       <w:r>
         <w:rPr>
@@ -2395,6 +2603,7 @@
     <w:p>
       <w:pPr>
         <w:spacing w:after="120"/>
+        <w:widowControl w:val="1"/>
       </w:pPr>
       <w:r>
         <w:rPr>
@@ -2433,6 +2642,9 @@
       <w:pPr>
         <w:pStyle w:val="Heading1"/>
         <w:spacing w:before="360" w:after="160"/>
+        <w:widowControl w:val="1"/>
+        <w:keepNext w:val="1"/>
+        <w:keepLines w:val="1"/>
       </w:pPr>
       <w:r>
         <w:rPr>
@@ -2449,6 +2661,7 @@
         <w:rPr>
           <w:rFonts w:hint="eastAsia"/>
         </w:rPr>
+        <w:widowControl w:val="1"/>
       </w:pPr>
       <w:r>
         <w:rPr>
@@ -2464,6 +2677,7 @@
         <w:rPr>
           <w:rFonts w:hint="eastAsia"/>
         </w:rPr>
+        <w:widowControl w:val="1"/>
       </w:pPr>
       <w:r>
         <w:rPr>
@@ -2490,11 +2704,13 @@
     <w:p>
       <w:pPr>
         <w:pStyle w:val="ListParagraph"/>
-        <w:keepLines/>
+        <w:keepLines w:val="1"/>
         <w:spacing w:after="80"/>
         <w:rPr>
           <w:rFonts w:hint="eastAsia"/>
         </w:rPr>
+        <w:widowControl w:val="1"/>
+        <w:keepNext w:val="1"/>
       </w:pPr>
       <w:r>
         <w:rPr>
@@ -2507,11 +2723,13 @@
     <w:p>
       <w:pPr>
         <w:pStyle w:val="ListParagraph"/>
-        <w:keepLines/>
+        <w:keepLines w:val="1"/>
         <w:spacing w:after="80"/>
         <w:rPr>
           <w:rFonts w:hint="eastAsia"/>
         </w:rPr>
+        <w:widowControl w:val="1"/>
+        <w:keepNext w:val="1"/>
       </w:pPr>
       <w:r>
         <w:rPr>
@@ -2524,11 +2742,13 @@
     <w:p>
       <w:pPr>
         <w:pStyle w:val="ListParagraph"/>
-        <w:keepLines/>
+        <w:keepLines w:val="1"/>
         <w:spacing w:after="80"/>
         <w:rPr>
           <w:rFonts w:hint="eastAsia"/>
         </w:rPr>
+        <w:widowControl w:val="1"/>
+        <w:keepNext w:val="1"/>
       </w:pPr>
       <w:r>
         <w:rPr>
@@ -2541,6 +2761,7 @@
     <w:p>
       <w:pPr>
         <w:spacing w:after="120"/>
+        <w:widowControl w:val="1"/>
       </w:pPr>
       <w:r>
         <w:rPr>
@@ -2581,6 +2802,7 @@
         <w:rPr>
           <w:rFonts w:hint="eastAsia"/>
         </w:rPr>
+        <w:widowControl w:val="1"/>
       </w:pPr>
       <w:r>
         <w:rPr>
@@ -2595,6 +2817,9 @@
       <w:pPr>
         <w:pStyle w:val="Heading1"/>
         <w:spacing w:before="360" w:after="160"/>
+        <w:widowControl w:val="1"/>
+        <w:keepNext w:val="1"/>
+        <w:keepLines w:val="1"/>
       </w:pPr>
       <w:r>
         <w:rPr>
@@ -2611,6 +2836,7 @@
         <w:rPr>
           <w:rFonts w:hint="eastAsia"/>
         </w:rPr>
+        <w:widowControl w:val="1"/>
       </w:pPr>
       <w:r>
         <w:rPr>
@@ -2626,6 +2852,7 @@
         <w:rPr>
           <w:rFonts w:hint="eastAsia"/>
         </w:rPr>
+        <w:widowControl w:val="1"/>
       </w:pPr>
       <w:r>
         <w:rPr>
@@ -2641,6 +2868,7 @@
         <w:rPr>
           <w:rFonts w:hint="eastAsia"/>
         </w:rPr>
+        <w:widowControl w:val="1"/>
       </w:pPr>
       <w:r>
         <w:rPr>
@@ -2655,6 +2883,9 @@
         <w:pStyle w:val="Heading1"/>
         <w:pageBreakBefore/>
         <w:spacing w:before="360" w:after="160"/>
+        <w:widowControl w:val="1"/>
+        <w:keepNext w:val="1"/>
+        <w:keepLines w:val="1"/>
       </w:pPr>
       <w:r>
         <w:rPr>
@@ -2673,6 +2904,7 @@
         <w:rPr>
           <w:rFonts w:hint="eastAsia"/>
         </w:rPr>
+        <w:widowControl w:val="1"/>
       </w:pPr>
       <w:r>
         <w:rPr>
@@ -2699,6 +2931,7 @@
         <w:rPr>
           <w:rFonts w:hint="eastAsia"/>
         </w:rPr>
+        <w:widowControl w:val="1"/>
       </w:pPr>
       <w:r>
         <w:rPr>
@@ -2725,6 +2958,7 @@
         <w:rPr>
           <w:rFonts w:hint="eastAsia"/>
         </w:rPr>
+        <w:widowControl w:val="1"/>
       </w:pPr>
       <w:r>
         <w:rPr>
@@ -2751,6 +2985,7 @@
         <w:rPr>
           <w:rFonts w:hint="eastAsia"/>
         </w:rPr>
+        <w:widowControl w:val="1"/>
       </w:pPr>
       <w:r>
         <w:rPr>
@@ -2777,6 +3012,7 @@
         <w:rPr>
           <w:rFonts w:hint="eastAsia"/>
         </w:rPr>
+        <w:widowControl w:val="1"/>
       </w:pPr>
       <w:r>
         <w:rPr>
@@ -2803,6 +3039,7 @@
         <w:rPr>
           <w:rFonts w:hint="eastAsia"/>
         </w:rPr>
+        <w:widowControl w:val="1"/>
       </w:pPr>
       <w:r>
         <w:rPr>
@@ -2829,6 +3066,7 @@
         <w:rPr>
           <w:rFonts w:hint="eastAsia"/>
         </w:rPr>
+        <w:widowControl w:val="1"/>
       </w:pPr>
       <w:r>
         <w:rPr>
@@ -2855,6 +3093,7 @@
         <w:rPr>
           <w:rFonts w:hint="eastAsia"/>
         </w:rPr>
+        <w:widowControl w:val="1"/>
       </w:pPr>
       <w:r>
         <w:rPr>
@@ -2871,6 +3110,7 @@
         <w:rPr>
           <w:rFonts w:hint="eastAsia"/>
         </w:rPr>
+        <w:widowControl w:val="1"/>
       </w:pPr>
       <w:r>
         <w:rPr>
@@ -2898,6 +3138,7 @@
         <w:rPr>
           <w:rFonts w:hint="eastAsia"/>
         </w:rPr>
+        <w:widowControl w:val="1"/>
       </w:pPr>
       <w:r>
         <w:rPr>
@@ -2924,6 +3165,7 @@
         <w:rPr>
           <w:rFonts w:hint="eastAsia"/>
         </w:rPr>
+        <w:widowControl w:val="1"/>
       </w:pPr>
       <w:r>
         <w:rPr>
@@ -2947,6 +3189,7 @@
       <w:pPr>
         <w:spacing w:after="80"/>
         <w:ind w:left="360" w:hanging="360"/>
+        <w:widowControl w:val="1"/>
       </w:pPr>
       <w:r>
         <w:rPr>
@@ -2960,6 +3203,7 @@
       <w:pPr>
         <w:spacing w:after="80"/>
         <w:ind w:left="360" w:hanging="360"/>
+        <w:widowControl w:val="1"/>
       </w:pPr>
       <w:r>
         <w:rPr>
@@ -2973,6 +3217,7 @@
       <w:pPr>
         <w:spacing w:after="80"/>
         <w:ind w:left="360" w:hanging="360"/>
+        <w:widowControl w:val="1"/>
       </w:pPr>
       <w:r>
         <w:rPr>
@@ -2986,6 +3231,7 @@
       <w:pPr>
         <w:spacing w:after="80"/>
         <w:ind w:left="360" w:hanging="360"/>
+        <w:widowControl w:val="1"/>
       </w:pPr>
       <w:r>
         <w:rPr>
@@ -2999,6 +3245,7 @@
       <w:pPr>
         <w:spacing w:after="80"/>
         <w:ind w:left="360" w:hanging="360"/>
+        <w:widowControl w:val="1"/>
       </w:pPr>
       <w:r>
         <w:rPr>
@@ -3013,6 +3260,9 @@
         <w:pStyle w:val="Heading1"/>
         <w:pageBreakBefore/>
         <w:spacing w:before="360" w:after="160"/>
+        <w:widowControl w:val="1"/>
+        <w:keepNext w:val="1"/>
+        <w:keepLines w:val="1"/>
       </w:pPr>
       <w:r>
         <w:rPr>
@@ -3031,6 +3281,7 @@
         <w:rPr>
           <w:rFonts w:hint="eastAsia"/>
         </w:rPr>
+        <w:widowControl w:val="1"/>
       </w:pPr>
       <w:r>
         <w:rPr>
@@ -3048,6 +3299,7 @@
         <w:rPr>
           <w:rFonts w:hint="eastAsia"/>
         </w:rPr>
+        <w:widowControl w:val="1"/>
       </w:pPr>
       <w:r>
         <w:rPr>
@@ -3062,6 +3314,7 @@
       <w:pPr>
         <w:spacing w:after="80"/>
         <w:ind w:left="360" w:hanging="360"/>
+        <w:widowControl w:val="1"/>
       </w:pPr>
       <w:r>
         <w:rPr>
@@ -3075,6 +3328,7 @@
       <w:pPr>
         <w:spacing w:after="80"/>
         <w:ind w:left="360" w:hanging="360"/>
+        <w:widowControl w:val="1"/>
       </w:pPr>
       <w:r>
         <w:rPr>
@@ -3091,6 +3345,7 @@
         <w:rPr>
           <w:rFonts w:hint="eastAsia"/>
         </w:rPr>
+        <w:widowControl w:val="1"/>
       </w:pPr>
       <w:r>
         <w:rPr>
@@ -3105,6 +3360,7 @@
       <w:pPr>
         <w:spacing w:after="80"/>
         <w:ind w:left="360" w:hanging="360"/>
+        <w:widowControl w:val="1"/>
       </w:pPr>
       <w:r>
         <w:rPr>
@@ -3121,6 +3377,7 @@
         <w:rPr>
           <w:rFonts w:hint="eastAsia"/>
         </w:rPr>
+        <w:widowControl w:val="1"/>
       </w:pPr>
       <w:r>
         <w:rPr>
@@ -3138,6 +3395,7 @@
         <w:rPr>
           <w:rFonts w:hint="eastAsia"/>
         </w:rPr>
+        <w:widowControl w:val="1"/>
       </w:pPr>
       <w:r>
         <w:rPr>
@@ -3155,6 +3413,7 @@
         <w:rPr>
           <w:rFonts w:hint="eastAsia"/>
         </w:rPr>
+        <w:widowControl w:val="1"/>
       </w:pPr>
       <w:r>
         <w:rPr>
@@ -3169,6 +3428,7 @@
       <w:pPr>
         <w:spacing w:after="80"/>
         <w:ind w:left="360" w:hanging="360"/>
+        <w:widowControl w:val="1"/>
       </w:pPr>
       <w:r>
         <w:rPr>
@@ -3185,6 +3445,7 @@
         <w:rPr>
           <w:rFonts w:hint="eastAsia"/>
         </w:rPr>
+        <w:widowControl w:val="1"/>
       </w:pPr>
       <w:r>
         <w:rPr>
@@ -3202,6 +3463,7 @@
         <w:rPr>
           <w:rFonts w:hint="eastAsia"/>
         </w:rPr>
+        <w:widowControl w:val="1"/>
       </w:pPr>
       <w:r>
         <w:rPr>
@@ -3219,6 +3481,7 @@
         <w:rPr>
           <w:rFonts w:hint="eastAsia"/>
         </w:rPr>
+        <w:widowControl w:val="1"/>
       </w:pPr>
       <w:r>
         <w:rPr>
@@ -3233,6 +3496,7 @@
       <w:pPr>
         <w:spacing w:after="80"/>
         <w:ind w:left="360" w:hanging="360"/>
+        <w:widowControl w:val="1"/>
       </w:pPr>
       <w:r>
         <w:rPr>
@@ -3246,6 +3510,7 @@
       <w:pPr>
         <w:spacing w:after="80"/>
         <w:ind w:left="360" w:hanging="360"/>
+        <w:widowControl w:val="1"/>
       </w:pPr>
       <w:r>
         <w:rPr>
@@ -3262,6 +3527,7 @@
         <w:rPr>
           <w:rFonts w:hint="eastAsia"/>
         </w:rPr>
+        <w:widowControl w:val="1"/>
       </w:pPr>
       <w:r>
         <w:rPr>
@@ -3276,6 +3542,7 @@
       <w:pPr>
         <w:spacing w:after="80"/>
         <w:ind w:left="360" w:hanging="360"/>
+        <w:widowControl w:val="1"/>
       </w:pPr>
       <w:r>
         <w:rPr>
@@ -3292,6 +3559,7 @@
         <w:rPr>
           <w:rFonts w:hint="eastAsia"/>
         </w:rPr>
+        <w:widowControl w:val="1"/>
       </w:pPr>
       <w:r>
         <w:rPr>
@@ -3309,6 +3577,7 @@
         <w:rPr>
           <w:rFonts w:hint="eastAsia"/>
         </w:rPr>
+        <w:widowControl w:val="1"/>
       </w:pPr>
       <w:r>
         <w:rPr>
@@ -3327,6 +3596,7 @@
         <w:rPr>
           <w:rFonts w:hint="eastAsia"/>
         </w:rPr>
+        <w:widowControl w:val="1"/>
       </w:pPr>
       <w:r>
         <w:rPr>
@@ -3344,6 +3614,7 @@
         <w:rPr>
           <w:rFonts w:hint="eastAsia"/>
         </w:rPr>
+        <w:widowControl w:val="1"/>
       </w:pPr>
       <w:r>
         <w:rPr>
@@ -3358,6 +3629,7 @@
       <w:pPr>
         <w:spacing w:after="80"/>
         <w:ind w:left="360" w:hanging="360"/>
+        <w:widowControl w:val="1"/>
       </w:pPr>
       <w:r>
         <w:rPr>
@@ -3374,6 +3646,7 @@
         <w:rPr>
           <w:rFonts w:hint="eastAsia"/>
         </w:rPr>
+        <w:widowControl w:val="1"/>
       </w:pPr>
       <w:r>
         <w:rPr>

</xml_diff>

<commit_message>
Loosen docx pagination where it was creating awkward white space
- Removed forced page breaks on §1, §7 SWOT, §11 Notes so they flow into
  the prior section instead of stranding bottom-of-page whitespace
- §12 Bibliography page break retained (standard convention)
- Stripped keepNext from 8 List Paragraph items so the §6.2 offers list
  and §9 Step 1/2/3 can break across pages naturally instead of jumping
  as a single glued block
- Heading 1 / Heading 2 keepNext + keepLines and the document-wide
  widowControl all preserved

Co-Authored-By: Claude Opus 4.7 <noreply@anthropic.com>
</commit_message>
<xml_diff>
--- a/forward-deployed-decade/assets/ISI.FDD.docx
+++ b/forward-deployed-decade/assets/ISI.FDD.docx
@@ -263,7 +263,6 @@
     <w:p>
       <w:pPr>
         <w:pStyle w:val="Heading1"/>
-        <w:pageBreakBefore/>
         <w:spacing w:before="360" w:after="160"/>
         <w:widowControl w:val="1"/>
         <w:keepNext w:val="1"/>
@@ -1446,7 +1445,6 @@
           <w:rFonts w:hint="eastAsia"/>
         </w:rPr>
         <w:widowControl w:val="1"/>
-        <w:keepNext w:val="1"/>
       </w:pPr>
       <w:r>
         <w:rPr>
@@ -1465,7 +1463,6 @@
           <w:rFonts w:hint="eastAsia"/>
         </w:rPr>
         <w:widowControl w:val="1"/>
-        <w:keepNext w:val="1"/>
       </w:pPr>
       <w:r>
         <w:rPr>
@@ -1484,7 +1481,6 @@
           <w:rFonts w:hint="eastAsia"/>
         </w:rPr>
         <w:widowControl w:val="1"/>
-        <w:keepNext w:val="1"/>
       </w:pPr>
       <w:r>
         <w:rPr>
@@ -1503,7 +1499,6 @@
           <w:rFonts w:hint="eastAsia"/>
         </w:rPr>
         <w:widowControl w:val="1"/>
-        <w:keepNext w:val="1"/>
       </w:pPr>
       <w:r>
         <w:rPr>
@@ -1522,7 +1517,6 @@
           <w:rFonts w:hint="eastAsia"/>
         </w:rPr>
         <w:widowControl w:val="1"/>
-        <w:keepNext w:val="1"/>
       </w:pPr>
       <w:r>
         <w:rPr>
@@ -1630,7 +1624,6 @@
     <w:p>
       <w:pPr>
         <w:pStyle w:val="Heading1"/>
-        <w:pageBreakBefore/>
         <w:spacing w:before="360" w:after="160"/>
         <w:widowControl w:val="1"/>
         <w:keepNext w:val="1"/>
@@ -2710,7 +2703,6 @@
           <w:rFonts w:hint="eastAsia"/>
         </w:rPr>
         <w:widowControl w:val="1"/>
-        <w:keepNext w:val="1"/>
       </w:pPr>
       <w:r>
         <w:rPr>
@@ -2729,7 +2721,6 @@
           <w:rFonts w:hint="eastAsia"/>
         </w:rPr>
         <w:widowControl w:val="1"/>
-        <w:keepNext w:val="1"/>
       </w:pPr>
       <w:r>
         <w:rPr>
@@ -2748,7 +2739,6 @@
           <w:rFonts w:hint="eastAsia"/>
         </w:rPr>
         <w:widowControl w:val="1"/>
-        <w:keepNext w:val="1"/>
       </w:pPr>
       <w:r>
         <w:rPr>
@@ -2881,7 +2871,6 @@
     <w:p>
       <w:pPr>
         <w:pStyle w:val="Heading1"/>
-        <w:pageBreakBefore/>
         <w:spacing w:before="360" w:after="160"/>
         <w:widowControl w:val="1"/>
         <w:keepNext w:val="1"/>

</xml_diff>

<commit_message>
Elevate whitepaper formatting so key info stops hiding in prose
- Executive thesis: prose 'first/second/third' → intro line plus a 1/2/3
  numbered list with hanging indent. Also swapped 'family churches' →
  'family farms' to match the §3.2 trimming.
- §1.1/1.2/1.3: each gets a bold all-caps kicker line under the heading
  (date · amount). Renders MAY 4, 2026 · $1.5 BILLION IN COMMITTED CAPITAL.
- §3: new 1×4 stats callout table at top of the section, no side borders,
  thin horizontal rules top and bottom, big Poppins numbers over small
  source-attributed labels (\$2T / 1/3 / 95% / 82%).
- Two academic pull quotes (italic, indented from both margins, hairline
  rules top and bottom, no color): one after §3.4, one in §10 closing.

Co-Authored-By: Claude Opus 4.7 <noreply@anthropic.com>
</commit_message>
<xml_diff>
--- a/forward-deployed-decade/assets/ISI.FDD.docx
+++ b/forward-deployed-decade/assets/ISI.FDD.docx
@@ -215,14 +215,52 @@
       </w:pPr>
       <w:r>
         <w:rPr>
-          <w:rFonts w:eastAsia="Open Sans" w:cs="Open Sans"/>
-          <w:color w:val="1E1D1C"/>
-        </w:rPr>
-        <w:t>This paper makes three observations. First, the AI consulting market the labs are entering is the Fortune 1000, one zip code above ISI's market. Second, the trades and middle-market economy (HVAC contractors, plumbers, auto and collision shops, restoration companies, heritage food processors, hurricane-shutter installers, heavy-equipment repair yards, and family churches that together account for one-third of U.S. private-sector GDP</w:t>
-      </w:r>
-      <w:r>
-        <w:rPr>
-          <w:rFonts w:eastAsia="Open Sans" w:cs="Open Sans"/>
+          <w:color w:val="1E1D1C"/>
+        </w:rPr>
+        <w:t>This paper makes three observations.</w:t>
+      </w:r>
+    </w:p>
+    <w:p>
+      <w:pPr>
+        <w:pStyle w:val="ListParagraph"/>
+        <w:spacing w:after="80"/>
+        <w:ind w:left="360" w:hanging="360"/>
+      </w:pPr>
+      <w:r>
+        <w:rPr>
+          <w:b/>
+          <w:color w:val="1E1D1C"/>
+        </w:rPr>
+        <w:t xml:space="preserve">1. </w:t>
+      </w:r>
+      <w:r>
+        <w:rPr>
+          <w:color w:val="1E1D1C"/>
+        </w:rPr>
+        <w:t>The AI consulting market the labs are entering is the Fortune 1000, one zip code above ISI's market.</w:t>
+      </w:r>
+    </w:p>
+    <w:p>
+      <w:pPr>
+        <w:pStyle w:val="ListParagraph"/>
+        <w:spacing w:after="80"/>
+        <w:ind w:left="360" w:hanging="360"/>
+      </w:pPr>
+      <w:r>
+        <w:rPr>
+          <w:b/>
+          <w:color w:val="1E1D1C"/>
+        </w:rPr>
+        <w:t xml:space="preserve">2. </w:t>
+      </w:r>
+      <w:r>
+        <w:rPr>
+          <w:color w:val="1E1D1C"/>
+        </w:rPr>
+        <w:t>The trades and middle-market economy (HVAC contractors, plumbers, auto and collision shops, restoration companies, heritage food processors, hurricane-shutter installers, heavy-equipment repair yards, and family farms that together account for one-third of U.S. private-sector GDP</w:t>
+      </w:r>
+      <w:r>
+        <w:rPr>
           <w:color w:val="1E1D1C"/>
           <w:vertAlign w:val="superscript"/>
         </w:rPr>
@@ -230,10 +268,29 @@
       </w:r>
       <w:r>
         <w:rPr>
-          <w:rFonts w:eastAsia="Open Sans" w:cs="Open Sans"/>
-          <w:color w:val="1E1D1C"/>
-        </w:rPr>
-        <w:t>) has no serious AI advisory coverage. Third, ISI is well-positioned to serve that market, because the bottleneck in mid-market AI is the operating discipline, and operating discipline is what ISI already sells.</w:t>
+          <w:color w:val="1E1D1C"/>
+        </w:rPr>
+        <w:t>) has no serious AI advisory coverage.</w:t>
+      </w:r>
+    </w:p>
+    <w:p>
+      <w:pPr>
+        <w:pStyle w:val="ListParagraph"/>
+        <w:spacing w:after="80"/>
+        <w:ind w:left="360" w:hanging="360"/>
+      </w:pPr>
+      <w:r>
+        <w:rPr>
+          <w:b/>
+          <w:color w:val="1E1D1C"/>
+        </w:rPr>
+        <w:t xml:space="preserve">3. </w:t>
+      </w:r>
+      <w:r>
+        <w:rPr>
+          <w:color w:val="1E1D1C"/>
+        </w:rPr>
+        <w:t>ISI is well-positioned to serve that market, because the bottleneck in mid-market AI is the operating discipline, and operating discipline is what ISI already sells.</w:t>
       </w:r>
     </w:p>
     <w:p>
@@ -312,6 +369,20 @@
     </w:p>
     <w:p>
       <w:pPr>
+        <w:spacing w:before="0" w:after="80"/>
+      </w:pPr>
+      <w:r>
+        <w:rPr>
+          <w:b/>
+          <w:color w:val="1E1D1C"/>
+          <w:sz w:val="18"/>
+          <w:caps w:val="1"/>
+        </w:rPr>
+        <w:t>May 4, 2026 · $1.5 billion in committed capital</w:t>
+      </w:r>
+    </w:p>
+    <w:p>
+      <w:pPr>
         <w:spacing w:after="120"/>
         <w:rPr>
           <w:rFonts w:hint="eastAsia"/>
@@ -367,6 +438,20 @@
     </w:p>
     <w:p>
       <w:pPr>
+        <w:spacing w:before="0" w:after="80"/>
+      </w:pPr>
+      <w:r>
+        <w:rPr>
+          <w:b/>
+          <w:color w:val="1E1D1C"/>
+          <w:sz w:val="18"/>
+          <w:caps w:val="1"/>
+        </w:rPr>
+        <w:t>May 11, 2026 · $4 billion in committed capital</w:t>
+      </w:r>
+    </w:p>
+    <w:p>
+      <w:pPr>
         <w:spacing w:after="120"/>
         <w:rPr>
           <w:rFonts w:hint="eastAsia"/>
@@ -414,6 +499,20 @@
     </w:p>
     <w:p>
       <w:pPr>
+        <w:spacing w:before="0" w:after="80"/>
+      </w:pPr>
+      <w:r>
+        <w:rPr>
+          <w:b/>
+          <w:color w:val="1E1D1C"/>
+          <w:sz w:val="18"/>
+          <w:caps w:val="1"/>
+        </w:rPr>
+        <w:t>April 22, 2026 · $750 million committed</w:t>
+      </w:r>
+    </w:p>
+    <w:p>
+      <w:pPr>
         <w:spacing w:after="120"/>
         <w:rPr>
           <w:rFonts w:hint="eastAsia"/>
@@ -652,6 +751,162 @@
         <w:t>3. The market the giants cannot profitably reach</w:t>
       </w:r>
     </w:p>
+    <w:tbl>
+      <w:tblPr>
+        <w:tblW w:type="auto" w:w="0"/>
+        <w:tblLayout w:type="fixed"/>
+        <w:tblLook w:firstColumn="1" w:firstRow="1" w:lastColumn="0" w:lastRow="0" w:noHBand="0" w:noVBand="1" w:val="04A0"/>
+        <w:tblBorders>
+          <w:top w:val="single" w:sz="8" w:color="auto"/>
+          <w:bottom w:val="single" w:sz="8" w:color="auto"/>
+          <w:left w:val="nil"/>
+          <w:right w:val="nil"/>
+          <w:insideH w:val="nil"/>
+          <w:insideV w:val="nil"/>
+        </w:tblBorders>
+      </w:tblPr>
+      <w:tblGrid>
+        <w:gridCol w:w="2160"/>
+        <w:gridCol w:w="2160"/>
+        <w:gridCol w:w="2160"/>
+        <w:gridCol w:w="2160"/>
+      </w:tblGrid>
+      <w:tr>
+        <w:tc>
+          <w:tcPr>
+            <w:tcW w:type="dxa" w:w="2340"/>
+          </w:tcPr>
+          <w:p>
+            <w:pPr>
+              <w:spacing w:after="40"/>
+              <w:jc w:val="left"/>
+            </w:pPr>
+            <w:r>
+              <w:rPr>
+                <w:rFonts w:ascii="Poppins" w:hAnsi="Poppins"/>
+                <w:b/>
+                <w:color w:val="1E1D1C"/>
+                <w:sz w:val="36"/>
+              </w:rPr>
+              <w:t>$2T</w:t>
+            </w:r>
+          </w:p>
+          <w:p>
+            <w:pPr>
+              <w:spacing w:after="0"/>
+            </w:pPr>
+            <w:r>
+              <w:rPr>
+                <w:color w:val="1E1D1C"/>
+                <w:sz w:val="14"/>
+              </w:rPr>
+              <w:t>Mid-market gen-AI value pool (WEF, 2026)</w:t>
+            </w:r>
+          </w:p>
+        </w:tc>
+        <w:tc>
+          <w:tcPr>
+            <w:tcW w:type="dxa" w:w="2340"/>
+          </w:tcPr>
+          <w:p>
+            <w:pPr>
+              <w:spacing w:after="40"/>
+              <w:jc w:val="left"/>
+            </w:pPr>
+            <w:r>
+              <w:rPr>
+                <w:rFonts w:ascii="Poppins" w:hAnsi="Poppins"/>
+                <w:b/>
+                <w:color w:val="1E1D1C"/>
+                <w:sz w:val="36"/>
+              </w:rPr>
+              <w:t>1/3</w:t>
+            </w:r>
+          </w:p>
+          <w:p>
+            <w:pPr>
+              <w:spacing w:after="0"/>
+            </w:pPr>
+            <w:r>
+              <w:rPr>
+                <w:color w:val="1E1D1C"/>
+                <w:sz w:val="14"/>
+              </w:rPr>
+              <w:t>Of U.S. private-sector GDP is mid-market (NCMM, 2025)</w:t>
+            </w:r>
+          </w:p>
+        </w:tc>
+        <w:tc>
+          <w:tcPr>
+            <w:tcW w:type="dxa" w:w="2340"/>
+          </w:tcPr>
+          <w:p>
+            <w:pPr>
+              <w:spacing w:after="40"/>
+              <w:jc w:val="left"/>
+            </w:pPr>
+            <w:r>
+              <w:rPr>
+                <w:rFonts w:ascii="Poppins" w:hAnsi="Poppins"/>
+                <w:b/>
+                <w:color w:val="1E1D1C"/>
+                <w:sz w:val="36"/>
+              </w:rPr>
+              <w:t>95%</w:t>
+            </w:r>
+          </w:p>
+          <w:p>
+            <w:pPr>
+              <w:spacing w:after="0"/>
+            </w:pPr>
+            <w:r>
+              <w:rPr>
+                <w:color w:val="1E1D1C"/>
+                <w:sz w:val="14"/>
+              </w:rPr>
+              <w:t>Of enterprise AI pilots fail to reach production (MIT NANDA, 2025)</w:t>
+            </w:r>
+          </w:p>
+        </w:tc>
+        <w:tc>
+          <w:tcPr>
+            <w:tcW w:type="dxa" w:w="2340"/>
+          </w:tcPr>
+          <w:p>
+            <w:pPr>
+              <w:spacing w:after="40"/>
+              <w:jc w:val="left"/>
+            </w:pPr>
+            <w:r>
+              <w:rPr>
+                <w:rFonts w:ascii="Poppins" w:hAnsi="Poppins"/>
+                <w:b/>
+                <w:color w:val="1E1D1C"/>
+                <w:sz w:val="36"/>
+              </w:rPr>
+              <w:t>82%</w:t>
+            </w:r>
+          </w:p>
+          <w:p>
+            <w:pPr>
+              <w:spacing w:after="0"/>
+            </w:pPr>
+            <w:r>
+              <w:rPr>
+                <w:color w:val="1E1D1C"/>
+                <w:sz w:val="14"/>
+              </w:rPr>
+              <w:t>Of small employers buy AI tools; median 5 (SBE Council, 2026)</w:t>
+            </w:r>
+          </w:p>
+        </w:tc>
+      </w:tr>
+    </w:tbl>
+    <w:p>
+      <w:pPr>
+        <w:spacing w:after="80"/>
+      </w:pPr>
+    </w:p>
     <w:p>
       <w:pPr>
         <w:pStyle w:val="Heading2"/>
@@ -820,6 +1075,27 @@
         </w:rPr>
         <w:lastRenderedPageBreak/>
         <w:t>wrenches. The bottom of the market does not have less opportunity. It has different opportunity, and the firms above it are economically incapable of reaching for it.</w:t>
+      </w:r>
+    </w:p>
+    <w:p>
+      <w:pPr>
+        <w:spacing w:before="200" w:after="200"/>
+        <w:ind w:left="720" w:right="720"/>
+        <w:jc w:val="center"/>
+        <w:pBdr>
+          <w:top w:val="single" w:sz="4" w:space="8" w:color="auto"/>
+          <w:bottom w:val="single" w:sz="4" w:space="8" w:color="auto"/>
+        </w:pBdr>
+        <w:keepLines w:val="1"/>
+        <w:widowControl w:val="1"/>
+      </w:pPr>
+      <w:r>
+        <w:rPr>
+          <w:i/>
+          <w:color w:val="1E1D1C"/>
+          <w:sz w:val="26"/>
+        </w:rPr>
+        <w:t>The bottom of the market does not have less opportunity. It has different opportunity.</w:t>
       </w:r>
     </w:p>
     <w:p>
@@ -2838,6 +3114,27 @@
     </w:p>
     <w:p>
       <w:pPr>
+        <w:spacing w:before="200" w:after="200"/>
+        <w:ind w:left="720" w:right="720"/>
+        <w:jc w:val="center"/>
+        <w:pBdr>
+          <w:top w:val="single" w:sz="4" w:space="8" w:color="auto"/>
+          <w:bottom w:val="single" w:sz="4" w:space="8" w:color="auto"/>
+        </w:pBdr>
+        <w:keepLines w:val="1"/>
+        <w:widowControl w:val="1"/>
+      </w:pPr>
+      <w:r>
+        <w:rPr>
+          <w:i/>
+          <w:color w:val="1E1D1C"/>
+          <w:sz w:val="26"/>
+        </w:rPr>
+        <w:t>The methodology is there. The clients are there. The tools are running today.</w:t>
+      </w:r>
+    </w:p>
+    <w:p>
+      <w:pPr>
         <w:spacing w:after="120"/>
         <w:rPr>
           <w:rFonts w:hint="eastAsia"/>

</xml_diff>

<commit_message>
Bold lead-ins on §6.2 offers and §9 steps
Each offer and step paragraph was a single flat run, so the structural
break between item-name and description was invisible to the eye.

- §6.2: added bold all-caps 'OFFER 1.' through 'OFFER 5.' prefix and
  bolded each offer's title. Bodies stay normal weight. OFFER 4 had no
  natural title-period so bold ends after 'Industry Deep-Dive Audits'.
- §9: bolded 'Step N. [title].' on Step 1/2/3; bodies normal weight.

No color, no font change — typographic emphasis only.

Co-Authored-By: Claude Opus 4.7 <noreply@anthropic.com>
</commit_message>
<xml_diff>
--- a/forward-deployed-decade/assets/ISI.FDD.docx
+++ b/forward-deployed-decade/assets/ISI.FDD.docx
@@ -1724,10 +1724,24 @@
       </w:pPr>
       <w:r>
         <w:rPr>
-          <w:rFonts w:eastAsia="Open Sans" w:cs="Open Sans"/>
-          <w:color w:val="1E1D1C"/>
-        </w:rPr>
-        <w:t>The Game. A build of the live monthly scoreboard described in Section 4: the Wall, the Goal, the Game, the Steps, with a thermometer, gauges, and a drill-down on every number. Tracks weekly progress against the monthly Goal across the four (sometimes five) weeks of the Game. Built against whatever systems the client already runs. Client owns the code, the credentials, and the hosting.</w:t>
+          <w:b/>
+          <w:color w:val="1E1D1C"/>
+          <w:caps w:val="1"/>
+        </w:rPr>
+        <w:t xml:space="preserve">OFFER 1. </w:t>
+      </w:r>
+      <w:r>
+        <w:rPr>
+          <w:b/>
+          <w:color w:val="1E1D1C"/>
+        </w:rPr>
+        <w:t>The Game.</w:t>
+      </w:r>
+      <w:r>
+        <w:rPr>
+          <w:color w:val="1E1D1C"/>
+        </w:rPr>
+        <w:t xml:space="preserve"> A build of the live monthly scoreboard described in Section 4: the Wall, the Goal, the Game, the Steps, with a thermometer, gauges, and a drill-down on every number. Tracks weekly progress against the monthly Goal across the four (sometimes five) weeks of the Game. Built against whatever systems the client already runs. Client owns the code, the credentials, and the hosting.</w:t>
       </w:r>
     </w:p>
     <w:p>
@@ -1742,10 +1756,24 @@
       </w:pPr>
       <w:r>
         <w:rPr>
-          <w:rFonts w:eastAsia="Open Sans" w:cs="Open Sans"/>
-          <w:color w:val="1E1D1C"/>
-        </w:rPr>
-        <w:t>AI-Augmented MAM. The Game wired into the weekly Management Accountability Meeting: an agent that prepares the agenda, the open UDEs, the prior week's commitments, and the proposed action items before the meeting starts. The client experiences a sharper weekly MAM. The end-state is a full CFM-to-UDE-to-Bloodwall-to-Game-to-MAM operating loop running on a weekly cadence against a monthly Game; the near-term offer is the agent-prepared weekly meeting pack and the Game that feeds it.</w:t>
+          <w:b/>
+          <w:color w:val="1E1D1C"/>
+          <w:caps w:val="1"/>
+        </w:rPr>
+        <w:t xml:space="preserve">OFFER 2. </w:t>
+      </w:r>
+      <w:r>
+        <w:rPr>
+          <w:b/>
+          <w:color w:val="1E1D1C"/>
+        </w:rPr>
+        <w:t>AI-Augmented MAM.</w:t>
+      </w:r>
+      <w:r>
+        <w:rPr>
+          <w:color w:val="1E1D1C"/>
+        </w:rPr>
+        <w:t xml:space="preserve"> The Game wired into the weekly Management Accountability Meeting: an agent that prepares the agenda, the open UDEs, the prior week's commitments, and the proposed action items before the meeting starts. The client experiences a sharper weekly MAM. The end-state is a full CFM-to-UDE-to-Bloodwall-to-Game-to-MAM operating loop running on a weekly cadence against a monthly Game; the near-term offer is the agent-prepared weekly meeting pack and the Game that feeds it.</w:t>
       </w:r>
     </w:p>
     <w:p>
@@ -1760,10 +1788,24 @@
       </w:pPr>
       <w:r>
         <w:rPr>
-          <w:rFonts w:eastAsia="Open Sans" w:cs="Open Sans"/>
-          <w:color w:val="1E1D1C"/>
-        </w:rPr>
-        <w:t>Campaign-as-Template Platform. A productized customer-outreach system the client's marketing lead can run without the consultant in the room: compose, schedule, send, track, suppress, parse replies. Already running in production: a single multi-hundred-recipient campaign at around 20 percent acceptance, a bounce scanner, a suppression list synchronized with the field-service system's do-not-contact tags. The principle (the marketing lead must be able to repeat the send without the consultant) is the same principle that makes the Game self-serve on MAM day: the client owns the operation, the consultant teaches the tool.</w:t>
+          <w:b/>
+          <w:color w:val="1E1D1C"/>
+          <w:caps w:val="1"/>
+        </w:rPr>
+        <w:t xml:space="preserve">OFFER 3. </w:t>
+      </w:r>
+      <w:r>
+        <w:rPr>
+          <w:b/>
+          <w:color w:val="1E1D1C"/>
+        </w:rPr>
+        <w:t>Campaign-as-Template Platform.</w:t>
+      </w:r>
+      <w:r>
+        <w:rPr>
+          <w:color w:val="1E1D1C"/>
+        </w:rPr>
+        <w:t xml:space="preserve"> A productized customer-outreach system the client's marketing lead can run without the consultant in the room: compose, schedule, send, track, suppress, parse replies. Already running in production: a single multi-hundred-recipient campaign at around 20 percent acceptance, a bounce scanner, a suppression list synchronized with the field-service system's do-not-contact tags. The principle (the marketing lead must be able to repeat the send without the consultant) is the same principle that makes the Game self-serve on MAM day: the client owns the operation, the consultant teaches the tool.</w:t>
       </w:r>
     </w:p>
     <w:p>
@@ -1778,10 +1820,24 @@
       </w:pPr>
       <w:r>
         <w:rPr>
-          <w:rFonts w:eastAsia="Open Sans" w:cs="Open Sans"/>
-          <w:color w:val="1E1D1C"/>
-        </w:rPr>
-        <w:t>Industry Deep-Dive Audits produce a single drillable HTML deliverable: revenue and gross margin by service line, year-over-year, with click-to-source drill on every aggregate. Shipped patterns to date: a plumbing-line deep dive that resolved a four-figure monthly margin question, a Google Business Profile and SEO scoreboard with a trade-flip playbook, and an AI-crawler audit for shops worried about how Claude, ChatGPT, and Google's AI Overviews are reading their websites.</w:t>
+          <w:b/>
+          <w:color w:val="1E1D1C"/>
+          <w:caps w:val="1"/>
+        </w:rPr>
+        <w:t xml:space="preserve">OFFER 4. </w:t>
+      </w:r>
+      <w:r>
+        <w:rPr>
+          <w:b/>
+          <w:color w:val="1E1D1C"/>
+        </w:rPr>
+        <w:t>Industry Deep-Dive Audits</w:t>
+      </w:r>
+      <w:r>
+        <w:rPr>
+          <w:color w:val="1E1D1C"/>
+        </w:rPr>
+        <w:t xml:space="preserve"> produce a single drillable HTML deliverable: revenue and gross margin by service line, year-over-year, with click-to-source drill on every aggregate. Shipped patterns to date: a plumbing-line deep dive that resolved a four-figure monthly margin question, a Google Business Profile and SEO scoreboard with a trade-flip playbook, and an AI-crawler audit for shops worried about how Claude, ChatGPT, and Google's AI Overviews are reading their websites.</w:t>
       </w:r>
     </w:p>
     <w:p>
@@ -1796,11 +1852,24 @@
       </w:pPr>
       <w:r>
         <w:rPr>
-          <w:rFonts w:eastAsia="Open Sans" w:cs="Open Sans"/>
-          <w:color w:val="1E1D1C"/>
-        </w:rPr>
-        <w:lastRenderedPageBreak/>
-        <w:t>Fractional AI Chief. A monthly retainer where the consultant serves as the outside AI conscience of the business: vendor selection, policy, governance, model-and-agent evaluation as the landscape shifts. Structurally similar to a fractional CFO. The natural conversion from the project-based offers above once the Game is running. This is also the retainer that makes the AI-teaching promise from Section 4.6 operationally real: the model landscape changes; the retainer is what translates the changes into the client's existing tools.</w:t>
+          <w:b/>
+          <w:color w:val="1E1D1C"/>
+          <w:caps w:val="1"/>
+        </w:rPr>
+        <w:t xml:space="preserve">OFFER 5. </w:t>
+      </w:r>
+      <w:r>
+        <w:rPr>
+          <w:b/>
+          <w:color w:val="1E1D1C"/>
+        </w:rPr>
+        <w:t>Fractional AI Chief.</w:t>
+      </w:r>
+      <w:r>
+        <w:rPr>
+          <w:color w:val="1E1D1C"/>
+        </w:rPr>
+        <w:t xml:space="preserve"> A monthly retainer where the consultant serves as the outside AI conscience of the business: vendor selection, policy, governance, model-and-agent evaluation as the landscape shifts. Structurally similar to a fractional CFO. The natural conversion from the project-based offers above once the Game is running. This is also the retainer that makes the AI-teaching promise from Section 4.6 operationally real: the model landscape changes; the retainer is what translates the changes into the client's existing tools.</w:t>
       </w:r>
     </w:p>
     <w:p>
@@ -2982,10 +3051,16 @@
       </w:pPr>
       <w:r>
         <w:rPr>
-          <w:rFonts w:eastAsia="Open Sans" w:cs="Open Sans"/>
-          <w:color w:val="1E1D1C"/>
-        </w:rPr>
-        <w:t>Step 1. Reference implementation. Stand up the full weekly CFM-to-UDE-to-Bloodwall-to-Game-to-MAM operating loop end-to-end on a single engagement: the integrated form the practice has been working toward, running weekly against a monthly Game. The Game is already live in production today; the rest of the loop is what gets wired around it. The deliverable is a working reference engagement, not a slide.</w:t>
+          <w:b/>
+          <w:color w:val="1E1D1C"/>
+        </w:rPr>
+        <w:t>Step 1. Reference implementation.</w:t>
+      </w:r>
+      <w:r>
+        <w:rPr>
+          <w:color w:val="1E1D1C"/>
+        </w:rPr>
+        <w:t xml:space="preserve"> Stand up the full weekly CFM-to-UDE-to-Bloodwall-to-Game-to-MAM operating loop end-to-end on a single engagement: the integrated form the practice has been working toward, running weekly against a monthly Game. The Game is already live in production today; the rest of the loop is what gets wired around it. The deliverable is a working reference engagement, not a slide.</w:t>
       </w:r>
     </w:p>
     <w:p>
@@ -3000,10 +3075,16 @@
       </w:pPr>
       <w:r>
         <w:rPr>
-          <w:rFonts w:eastAsia="Open Sans" w:cs="Open Sans"/>
-          <w:color w:val="1E1D1C"/>
-        </w:rPr>
-        <w:t>Step 2. The pattern playbook. Write the Game's build guide (the Wall, the Goal, the Game, the Steps, the thermometer, the gauges, the drill-down) as a vertical-neutral document a second consultant could follow without the original builder in the room. The test is not whether the playbook reads well; it is whether a second consultant can pick it up cold and start building.</w:t>
+          <w:b/>
+          <w:color w:val="1E1D1C"/>
+        </w:rPr>
+        <w:t>Step 2. The pattern playbook.</w:t>
+      </w:r>
+      <w:r>
+        <w:rPr>
+          <w:color w:val="1E1D1C"/>
+        </w:rPr>
+        <w:t xml:space="preserve"> Write the Game's build guide (the Wall, the Goal, the Game, the Steps, the thermometer, the gauges, the drill-down) as a vertical-neutral document a second consultant could follow without the original builder in the room. The test is not whether the playbook reads well; it is whether a second consultant can pick it up cold and start building.</w:t>
       </w:r>
     </w:p>
     <w:p>
@@ -3018,10 +3099,16 @@
       </w:pPr>
       <w:r>
         <w:rPr>
-          <w:rFonts w:eastAsia="Open Sans" w:cs="Open Sans"/>
-          <w:color w:val="1E1D1C"/>
-        </w:rPr>
-        <w:t>Step 3. Prove the pattern is trainable. A second consultant inside ISI builds a second Game on a second engagement, working from the playbook. If that build lands, the practice is real: the methodology has been shown to transfer, and whether ISI trains five more consultants in it, fifty, or all three hundred and fifty is a decision the firm makes from a position of evidence. If the second build stalls, the playbook gets another draft and the pattern is not yet ready to scale. Either way, what is handed to ISI at the end of Step 3 is the same set of artifacts: a reference engagement, a build guide, and a second consultant who has used both.</w:t>
+          <w:b/>
+          <w:color w:val="1E1D1C"/>
+        </w:rPr>
+        <w:t>Step 3. Prove the pattern is trainable.</w:t>
+      </w:r>
+      <w:r>
+        <w:rPr>
+          <w:color w:val="1E1D1C"/>
+        </w:rPr>
+        <w:t xml:space="preserve"> A second consultant inside ISI builds a second Game on a second engagement, working from the playbook. If that build lands, the practice is real: the methodology has been shown to transfer, and whether ISI trains five more consultants in it, fifty, or all three hundred and fifty is a decision the firm makes from a position of evidence. If the second build stalls, the playbook gets another draft and the pattern is not yet ready to scale. Either way, what is handed to ISI at the end of Step 3 is the same set of artifacts: a reference engagement, a build guide, and a second consultant who has used both.</w:t>
       </w:r>
     </w:p>
     <w:p>

</xml_diff>

<commit_message>
Reframe whitepaper: AI training is the regular motion, Game is one option
</commit_message>
<xml_diff>
--- a/forward-deployed-decade/assets/ISI.FDD.docx
+++ b/forward-deployed-decade/assets/ISI.FDD.docx
@@ -2247,7 +2247,7 @@
                 <w:color w:val="1E1D1C"/>
                 <w:sz w:val="18"/>
               </w:rPr>
-              <w:t xml:space="preserve">• </w:t>
+              <w:t>• Built ad hoc inside engagements rather than as a teachable module; needs to be packaged before it can spread across the AI client work consultants are already running.</w:t>
             </w:r>
             <w:r>
               <w:rPr>
@@ -2255,7 +2255,6 @@
                 <w:color w:val="1E1D1C"/>
                 <w:sz w:val="18"/>
               </w:rPr>
-              <w:t>Currently delivered ad hoc, depending on client request; the build has not yet been documented for transfer.</w:t>
             </w:r>
           </w:p>
           <w:p>
@@ -3022,21 +3021,19 @@
           <w:rFonts w:eastAsia="Open Sans" w:cs="Open Sans"/>
           <w:color w:val="1E1D1C"/>
         </w:rPr>
-        <w:t>The launch plan that follows is not a sales plan</w:t>
+        <w:t>ISI consultants are already training clients on AI. What follows is the work to make the Game one of the options inside that work — a concrete pattern any consultant can pick up and bring to an engagement. Three steps, each the prerequisite for the next.</w:t>
       </w:r>
       <w:r>
         <w:rPr>
           <w:rFonts w:eastAsia="Open Sans" w:cs="Open Sans"/>
           <w:color w:val="1E1D1C"/>
         </w:rPr>
-        <w:t xml:space="preserve"> but the incremental steps to </w:t>
       </w:r>
       <w:r>
         <w:rPr>
           <w:rFonts w:eastAsia="Open Sans" w:cs="Open Sans"/>
           <w:color w:val="1E1D1C"/>
         </w:rPr>
-        <w:t>prove that what is described in this paper is a real, trainable practice and not a one-consultant act. Three steps, each the prerequisite for the next.</w:t>
       </w:r>
     </w:p>
     <w:p>
@@ -3084,7 +3081,7 @@
         <w:rPr>
           <w:color w:val="1E1D1C"/>
         </w:rPr>
-        <w:t xml:space="preserve"> Write the Game's build guide (the Wall, the Goal, the Game, the Steps, the thermometer, the gauges, the drill-down) as a vertical-neutral document a second consultant could follow without the original builder in the room. The test is not whether the playbook reads well; it is whether a second consultant can pick it up cold and start building.</w:t>
+        <w:t xml:space="preserve"> Write the Game's build guide (the Wall, the Goal, the Game, the Steps, the thermometer, the gauges, the drill-down) as a vertical-neutral document any ISI consultant can hand a client as part of the AI work they're already doing. The test is whether a consultant can pick it up and start building inside their next engagement.</w:t>
       </w:r>
     </w:p>
     <w:p>
@@ -3102,13 +3099,13 @@
           <w:b/>
           <w:color w:val="1E1D1C"/>
         </w:rPr>
-        <w:t>Step 3. Prove the pattern is trainable.</w:t>
-      </w:r>
-      <w:r>
-        <w:rPr>
-          <w:color w:val="1E1D1C"/>
-        </w:rPr>
-        <w:t xml:space="preserve"> A second consultant inside ISI builds a second Game on a second engagement, working from the playbook. If that build lands, the practice is real: the methodology has been shown to transfer, and whether ISI trains five more consultants in it, fifty, or all three hundred and fifty is a decision the firm makes from a position of evidence. If the second build stalls, the playbook gets another draft and the pattern is not yet ready to scale. Either way, what is handed to ISI at the end of Step 3 is the same set of artifacts: a reference engagement, a build guide, and a second consultant who has used both.</w:t>
+        <w:t>Step 3. Prove the pattern transfers.</w:t>
+      </w:r>
+      <w:r>
+        <w:rPr>
+          <w:color w:val="1E1D1C"/>
+        </w:rPr>
+        <w:t xml:space="preserve"> A consultant outside the reference engagement builds a Game on their own client, working from the playbook. If that build lands, the Game graduates from a one-engagement pattern into a documented option ISI consultants can carry into the AI work they're already doing with clients. Whether five take it up, fifty, or it becomes a default is a decision the firm makes from a position of evidence. If the build stalls, the playbook gets another draft and the pattern is not yet ready to spread. Either way, what is handed to ISI at the end of Step 3 is the same set of artifacts: a reference engagement, a build guide, and a second consultant who has used both.</w:t>
       </w:r>
     </w:p>
     <w:p>
@@ -3249,7 +3246,7 @@
           <w:rFonts w:eastAsia="Open Sans" w:cs="Open Sans"/>
           <w:color w:val="1E1D1C"/>
         </w:rPr>
-        <w:t>The methodology is there: Critical Path Methodology, with the Cash Flow Model, the Wall, the UDE log, the Bloodwall, and the MAM that ISI has been running for decades. The clients are there. The tools are running today, in production, in engagements that span HVAC, plumbing, auto, hurricane shutters, heritage food, and small institutions. The proposal is to name the practice, prove the pattern transfers, and let ISI scale it on whatever terms the firm chooses.</w:t>
+        <w:t>The methodology is there: Critical Path Methodology, with the Cash Flow Model, the Wall, the UDE log, the Bloodwall, and the MAM that ISI has been running for decades. The clients are there. ISI consultants are already training those clients on AI. The tools are running today, in production, in engagements that span HVAC, plumbing, auto, hurricane shutters, heritage food, and small institutions. The proposal is to name the Game as one option inside that work, document the pattern so it transfers cleanly, and let ISI scale it on whatever terms the firm chooses.</w:t>
       </w:r>
     </w:p>
     <w:p>

</xml_diff>

<commit_message>
Randomize trade-vertical examples across whitepaper
Replace five repeating mentions of HVAC/plumbing/auto/hurricane shutters/
heritage food/heavy equipment with non-overlapping trios drawn from a
broader 20-vertical list, reflecting the nationwide engagement base.
Rewrite section 9 lead-in to frame the work as moving from ad hoc
consultant projects to a common framework.

Co-Authored-By: Claude Opus 4.7 <noreply@anthropic.com>
</commit_message>
<xml_diff>
--- a/forward-deployed-decade/assets/ISI.FDD.docx
+++ b/forward-deployed-decade/assets/ISI.FDD.docx
@@ -251,26 +251,23 @@
           <w:b/>
           <w:color w:val="1E1D1C"/>
         </w:rPr>
-        <w:t xml:space="preserve">2. </w:t>
-      </w:r>
-      <w:r>
-        <w:rPr>
-          <w:color w:val="1E1D1C"/>
-        </w:rPr>
-        <w:t>The trades and middle-market economy (HVAC contractors, plumbers, auto and collision shops, restoration companies, heritage food processors, hurricane-shutter installers, heavy-equipment repair yards, and family farms that together account for one-third of U.S. private-sector GDP</w:t>
+        <w:t>2. The trades and middle-market economy, including shops like HVAC, plumbing, and auto repair, accounts for one-third of U.S. private-sector GDP8 and has no serious AI advisory coverage.</w:t>
+      </w:r>
+      <w:r>
+        <w:rPr>
+          <w:color w:val="1E1D1C"/>
+        </w:rPr>
       </w:r>
       <w:r>
         <w:rPr>
           <w:color w:val="1E1D1C"/>
           <w:vertAlign w:val="superscript"/>
         </w:rPr>
-        <w:t>8</w:t>
-      </w:r>
-      <w:r>
-        <w:rPr>
-          <w:color w:val="1E1D1C"/>
-        </w:rPr>
-        <w:t>) has no serious AI advisory coverage.</w:t>
+      </w:r>
+      <w:r>
+        <w:rPr>
+          <w:color w:val="1E1D1C"/>
+        </w:rPr>
       </w:r>
     </w:p>
     <w:p>
@@ -987,7 +984,7 @@
           <w:rFonts w:eastAsia="Open Sans" w:cs="Open Sans"/>
           <w:color w:val="1E1D1C"/>
         </w:rPr>
-        <w:t>Inside ISI's engagement base, which spans HVAC, plumbing, auto and collision repair, hurricane shutters, heritage food processing, heavy equipment, and family farms, the typical operator runs no agents, has mapped no workflows, and is still doing weekly job costing in a spreadsheet emailed between an estimator and a bookkeeper. The economic potential is the same as for any mid-market firm; the path to capture it is meaningfully harder, and the available advisors are meaningfully fewer.</w:t>
+        <w:t>Inside ISI's engagement base, which spans roofing, collision repair, and electrical, the typical operator runs no agents, has mapped no workflows, and is still doing weekly job costing in a spreadsheet emailed between an estimator and a bookkeeper. The economic potential is the same as for any mid-market firm; the path to capture it is meaningfully harder, and the available advisors are meaningfully fewer.</w:t>
       </w:r>
     </w:p>
     <w:p>
@@ -2782,7 +2779,7 @@
           <w:rFonts w:eastAsia="Open Sans" w:cs="Open Sans"/>
           <w:color w:val="1E1D1C"/>
         </w:rPr>
-        <w:t>As AI tooling gets easier, the consulting premium on basic implementation will compress. The defense is depth: niche expertise in specific verticals (HVAC and plumbing, auto and collision, hurricane shutters, heritage food, heavy equipment).</w:t>
+        <w:t>As AI tooling gets easier, the consulting premium on basic implementation will compress. The defense is depth: niche expertise in specific verticals (welding, stone fabrication, glazing).</w:t>
       </w:r>
     </w:p>
     <w:p>
@@ -3021,7 +3018,7 @@
           <w:rFonts w:eastAsia="Open Sans" w:cs="Open Sans"/>
           <w:color w:val="1E1D1C"/>
         </w:rPr>
-        <w:t>ISI consultants are already training clients on AI. What follows is the work to make the Game one of the options inside that work — a concrete pattern any consultant can pick up and bring to an engagement. Three steps, each the prerequisite for the next.</w:t>
+        <w:t>ISI consultants are already training clients on AI across the country. What follows is the work to make the Game one of the options inside that work, a concrete pattern any consultant can pick up and bring to an engagement, so the firm's AI work moves from individual consultants running ad hoc projects to a common framework all of them can build from. Three steps, each the prerequisite for the next.</w:t>
       </w:r>
       <w:r>
         <w:rPr>
@@ -3246,7 +3243,7 @@
           <w:rFonts w:eastAsia="Open Sans" w:cs="Open Sans"/>
           <w:color w:val="1E1D1C"/>
         </w:rPr>
-        <w:t>The methodology is there: Critical Path Methodology, with the Cash Flow Model, the Wall, the UDE log, the Bloodwall, and the MAM that ISI has been running for decades. The clients are there. ISI consultants are already training those clients on AI. The tools are running today, in production, in engagements that span HVAC, plumbing, auto, hurricane shutters, heritage food, and small institutions. The proposal is to name the Game as one option inside that work, document the pattern so it transfers cleanly, and let ISI scale it on whatever terms the firm chooses.</w:t>
+        <w:t>The methodology is there: Critical Path Methodology, with the Cash Flow Model, the Wall, the UDE log, the Bloodwall, and the MAM that ISI has been running for decades. The clients are there. ISI consultants are already training those clients on AI. The tools are running today, in production, in engagements that span tree service, fire suppression, and septic service. The proposal is to name the Game as one option inside that work, document the pattern so it transfers cleanly, and let ISI scale it on whatever terms the firm chooses.</w:t>
       </w:r>
     </w:p>
     <w:p>

</xml_diff>

<commit_message>
Bold the Step 4 prefix in §9 and the Obs 4 prefix in the executive thesis
Step 1-3 and Obs 1-3 use a bold "[N]. [title]. " leading run with a
non-bold body run. The insertions for Step 4 (Build the Apprentice)
and Obs 4 (the archive-as-asset) were single non-bold runs. Splits
them into the matching two-run pattern.

Co-Authored-By: Claude Opus 4.7 <noreply@anthropic.com>
</commit_message>
<xml_diff>
--- a/forward-deployed-decade/assets/ISI.FDD.docx
+++ b/forward-deployed-decade/assets/ISI.FDD.docx
@@ -254,9 +254,16 @@
       <w:proofErr w:type="gramEnd"/>
       <w:r>
         <w:rPr>
-          <w:color w:val="1E1D1C"/>
-        </w:rPr>
-        <w:t>4. ISI owns a thirty-year archive of trades operating documents that the labs cannot manufacture and the SaaS giants do not have. Sanitized and trained into an open-weight model, that archive becomes the Apprentice, the consultant's pattern recognition compressed into weights and deployed inside the client's own infrastructure.</w:t>
+          <w:b/>
+          <w:color w:val="1E1D1C"/>
+        </w:rPr>
+        <w:t xml:space="preserve">4. </w:t>
+      </w:r>
+      <w:r>
+        <w:rPr>
+          <w:color w:val="1E1D1C"/>
+        </w:rPr>
+        <w:t>ISI owns a thirty-year archive of trades operating documents that the labs cannot manufacture and the SaaS giants do not have. Sanitized and trained into an open-weight model, that archive becomes the Apprentice, the consultant's pattern recognition compressed into weights and deployed inside the client's own infrastructure.</w:t>
       </w:r>
     </w:p>
     <w:p>
@@ -3233,9 +3240,16 @@
       <w:proofErr w:type="gramEnd"/>
       <w:r>
         <w:rPr>
-          <w:color w:val="1E1D1C"/>
-        </w:rPr>
-        <w:t>Step 4. Build the Apprentice. While Steps 1 through 3 prove the Game's pattern transfers across the practice, the firm begins the technical project that turns ISI's thirty-year archive into a deployable model. Sanitization first: a current-generation frontier model strips identifying detail from the archive and generalizes specifics into patterns, with human review on high-risk samples. Fine-tune next: the sanitized corpus is trained into an open-weight base model (the current open frontier as of build day). Deploy third: the Apprentice ships alongside the reference engagement and runs on the client's own infrastructure. The technical track runs in parallel with the operational rollout. The Fractional AI Chief retainer is what keeps both threads sewn together at every client.</w:t>
+          <w:b/>
+          <w:color w:val="1E1D1C"/>
+        </w:rPr>
+        <w:t xml:space="preserve">Step 4. Build the Apprentice. </w:t>
+      </w:r>
+      <w:r>
+        <w:rPr>
+          <w:color w:val="1E1D1C"/>
+        </w:rPr>
+        <w:t>While Steps 1 through 3 prove the Game's pattern transfers across the practice, the firm begins the technical project that turns ISI's thirty-year archive into a deployable model. Sanitization first: a current-generation frontier model strips identifying detail from the archive and generalizes specifics into patterns, with human review on high-risk samples. Fine-tune next: the sanitized corpus is trained into an open-weight base model (the current open frontier as of build day). Deploy third: the Apprentice ships alongside the reference engagement and runs on the client's own infrastructure. The technical track runs in parallel with the operational rollout. The Fractional AI Chief retainer is what keeps both threads sewn together at every client.</w:t>
       </w:r>
     </w:p>
     <w:p>

</xml_diff>

<commit_message>
Sharpen Apprentice psychology, cross-system framing, and Offer 5
- §8.3: Apprentice triggers a mentorship instinct rather than a threat
  response (one sentence, names why the metaphor works)
- §5.6: "Frankenstein-monster stack glued together over a decade" as
  the opener to the cross-system synthesis paragraph
- §6.2 Offer 5: "financial bodyguard the SaaS vendors don't get to bill
  past" replaces "outside AI conscience" framing; site Offer 5 card
  matches

Co-Authored-By: Claude Opus 4.7 <noreply@anthropic.com>
</commit_message>
<xml_diff>
--- a/forward-deployed-decade/assets/ISI.FDD.docx
+++ b/forward-deployed-decade/assets/ISI.FDD.docx
@@ -1647,7 +1647,7 @@
         <w:rPr>
           <w:color w:val="1E1D1C"/>
         </w:rPr>
-        <w:t>The shop the Game serves runs a field-service platform, a fifteen-year-old QuickBooks file, a payroll system the bookkeeper exports by hand, an estimating workbench the salesman built in Excel, and a stack of scanned paper invoices the owner refuses to digitize. A ServiceTitan dashboard sees the ServiceTitan slice. The Game sees the whole shop. That gap is not closeable by a vendor whose commercial model requires the data live inside their platform. It is closeable by a consultant who builds in the client's name across whatever systems the client already runs. Cross-system synthesis is the mode the labs and the SaaS giants are structurally unable to occupy.</w:t>
+        <w:t>The shop the Game serves runs a Frankenstein-monster stack glued together over a decade: a field-service platform, a fifteen-year-old QuickBooks file, a payroll system the bookkeeper exports by hand, an estimating workbench the salesman built in Excel, and a stack of scanned paper invoices the owner refuses to digitize. A ServiceTitan dashboard sees the ServiceTitan slice. The Game sees the whole shop. That gap is not closeable by a vendor whose commercial model requires the data live inside their platform. It is closeable by a consultant who builds in the client's name across whatever systems the client already runs. Cross-system synthesis is the mode the labs and the SaaS giants are structurally unable to occupy.</w:t>
       </w:r>
     </w:p>
     <w:p>
@@ -1887,7 +1887,7 @@
         <w:rPr>
           <w:color w:val="1E1D1C"/>
         </w:rPr>
-        <w:t>A monthly retainer that puts the Apprentice on the client's hardware and keeps it sharp. The Apprentice is an open-weight model (Llama-class, downloadable, no per-token meter on the inference side) fine-tuned on ISI's sanitized 30-year operating corpus. It speaks CPM natively, knows the Wall shapes that work in trades shops, and prepares the weekly MAM pack with patterns drawn from three decades of practice. The retainer is the work that keeps it current: re-baking the model when a better base ships, refreshing the corpus as new patterns surface, swapping inference providers when the math changes, and serving as the outside AI conscience on vendor selection, policy, governance, and the automated upselling the SaaS platforms increasingly aim at the owner. The Apprentice runs on the client's infrastructure and is owned by the client. Lapse the retainer and the Apprentice keeps running; it just goes stale. The retainer is the value, not the lock-in. The natural conversion from the project-based offers above once the Game is running.</w:t>
+        <w:t>A monthly retainer that puts the Apprentice on the client's hardware and keeps it sharp. The Apprentice is an open-weight model (Llama-class, downloadable, no per-token meter on the inference side) fine-tuned on ISI's sanitized 30-year operating corpus. It speaks CPM natively, knows the Wall shapes that work in trades shops, and prepares the weekly MAM pack with patterns drawn from three decades of practice. The retainer is the work that keeps it current: re-baking the model when a better base ships, refreshing the corpus as new patterns surface, swapping inference providers when the math changes, and serving as the financial bodyguard the SaaS vendors don't get to bill past: vendor selection, policy, governance, and a hard look at every automated upsell the platforms aim at the owner. The Apprentice runs on the client's infrastructure and is owned by the client. Lapse the retainer and the Apprentice keeps running; it just goes stale. The retainer is the value, not the lock-in. The natural conversion from the project-based offers above once the Game is running.</w:t>
       </w:r>
     </w:p>
     <w:p>
@@ -2923,7 +2923,7 @@
         <w:rPr>
           <w:color w:val="1E1D1C"/>
         </w:rPr>
-        <w:t>Frame the AI as an Apprentice, the open-weight model described in section 5.6 and offered on retainer as Offer 5, not as an autonomous agent. An autonomous agent sounds like the thing coming for the service manager's job. An Apprentice is something the manager teaches and supervises. The Apprentice's only assignment in week one is to prepare the weekly MAM pack: the open UDEs from the Bloodwall, last week's commitments, the proposed agenda, the numbers on the Game. The service manager walks the team through it. If the Apprentice missed something, the manager catches it in the room. If the Apprentice caught something useful, the manager takes credit for the catch. The power dynamic stays right. The tool serves the manager. The manager is still the one accountable to the owner.</w:t>
+        <w:t>Frame the AI as an Apprentice, the open-weight model described in section 5.6 and offered on retainer as Offer 5, not as an autonomous agent. An autonomous agent sounds like the thing coming for the service manager's job. An Apprentice is something the manager teaches and supervises. Apprentice triggers a mentorship instinct rather than a threat response. The Apprentice's only assignment in week one is to prepare the weekly MAM pack: the open UDEs from the Bloodwall, last week's commitments, the proposed agenda, the numbers on the Game. The service manager walks the team through it. If the Apprentice missed something, the manager catches it in the room. If the Apprentice caught something useful, the manager takes credit for the catch. The power dynamic stays right. The tool serves the manager. The manager is still the one accountable to the owner.</w:t>
       </w:r>
     </w:p>
     <w:p>

</xml_diff>

<commit_message>
War-game vertical-SaaS-native-AI threat in §5.6, SWOT, and §9
- §5.6 picks up two new paragraphs: name what ServiceTitan and the other
  vertical platforms can ship in 18 months (native scoreboards on data
  they already own) and what they structurally cannot (cross-system
  synthesis, independence from their own product roadmap, niche-vertical
  reach). Concede the single-vendor-tidy-stack shop; defend the rest.
- SWOT Threats: new bullet on vertical-SaaS native AI surfaces with the
  silo-problem / niche-depth / structural-independence defenses named.
  Site SWOT bullet matches.
- §9: new paragraph on the output-side clock. Vertical SaaS will ship in
  ~18 months; the four steps are a race against both that clock and the
  cheap-build token-economics window.

Co-Authored-By: Claude Opus 4.7 <noreply@anthropic.com>
</commit_message>
<xml_diff>
--- a/forward-deployed-decade/assets/ISI.FDD.docx
+++ b/forward-deployed-decade/assets/ISI.FDD.docx
@@ -1648,6 +1648,28 @@
           <w:color w:val="1E1D1C"/>
         </w:rPr>
         <w:t>The shop the Game serves runs a Frankenstein-monster stack glued together over a decade: a field-service platform, a fifteen-year-old QuickBooks file, a payroll system the bookkeeper exports by hand, an estimating workbench the salesman built in Excel, and a stack of scanned paper invoices the owner refuses to digitize. A ServiceTitan dashboard sees the ServiceTitan slice. The Game sees the whole shop. That gap is not closeable by a vendor whose commercial model requires the data live inside their platform. It is closeable by a consultant who builds in the client's name across whatever systems the client already runs. Cross-system synthesis is the mode the labs and the SaaS giants are structurally unable to occupy.</w:t>
+      </w:r>
+    </w:p>
+    <w:p>
+      <w:pPr>
+        <w:spacing w:after="120" w:before="240"/>
+      </w:pPr>
+      <w:r>
+        <w:rPr>
+          <w:color w:val="1E1D1C"/>
+        </w:rPr>
+        <w:t>Be honest about where the line falls. The shop that is 90 percent inside ServiceTitan, with a tidy single-vendor stack and a manager who already trusts the platform, will get most of the value out of ServiceTitan’s native AI surface at no additional cost. ISI does not need to win that engagement. The engagements that matter are the ones the vertical platforms structurally cannot serve: shops with multi-vendor stacks, shops in verticals the platforms do not cover (welding, stone fabrication, glazing, heavy equipment, food processing, marine repair), shops where data sovereignty is a real concern, and shops where the owner does not want a software vendor to also be the operating advisor. That cohort is most of ISI’s engagement base today, and the platforms cannot reach it without breaking their own commercial model.</w:t>
+      </w:r>
+    </w:p>
+    <w:p>
+      <w:pPr>
+        <w:spacing w:after="120" w:before="240"/>
+      </w:pPr>
+      <w:r>
+        <w:rPr>
+          <w:color w:val="1E1D1C"/>
+        </w:rPr>
+        <w:t>There is a posture the platforms cannot adopt without breaking that model. ServiceTitan’s AI Chief, however good, will never tell the owner to drop a ServiceTitan module. The Apprentice, deployed through the Fractional AI Chief retainer, will. The independence is the moat the cross-system reach makes operational.</w:t>
       </w:r>
     </w:p>
     <w:p>
@@ -2809,6 +2831,25 @@
               <w:t>Cross-client confidentiality risk in corpus-trained models: a fine-tuned model can leak training examples under pressure. The sanitization pipeline strips identifying detail and generalizes specifics into patterns before any weight is touched; no client's raw documents enter the training set. The Fractional AI Chief retainer carries the discipline forward as the archive grows.</w:t>
             </w:r>
           </w:p>
+          <w:p>
+            <w:pPr>
+              <w:spacing w:after="60"/>
+              <w:ind w:left="173" w:hanging="173"/>
+            </w:pPr>
+            <w:r>
+              <w:rPr>
+                <w:b/>
+                <w:color w:val="1E1D1C"/>
+              </w:rPr>
+              <w:t xml:space="preserve">• </w:t>
+            </w:r>
+            <w:r>
+              <w:rPr>
+                <w:color w:val="1E1D1C"/>
+              </w:rPr>
+              <w:t>Vertical SaaS native AI surfaces. ServiceTitan, Jobber, Housecall Pro, AccuLynx, and their vertical analogues will ship native AI scoreboards inside the next eighteen months, bundled into existing subscriptions. Single-vendor shops will get 70-80 percent of the Apprentice’s value at zero additional cost. The defenses are the silo problem (cross-system synthesis the platforms cannot perform), niche-vertical depth (verticals the platforms do not cover), and the structural independence the platforms cannot offer because their AI is incentivized to upsell their own product.</w:t>
+            </w:r>
+          </w:p>
         </w:tc>
       </w:tr>
     </w:tbl>
@@ -3285,6 +3326,17 @@
           <w:color w:val="1E1D1C"/>
         </w:rPr>
         <w:t xml:space="preserve"> The window in which a small consultancy can build, ship, and price tools against current token economics is open now. Step 1 is best executed inside it.</w:t>
+      </w:r>
+    </w:p>
+    <w:p>
+      <w:pPr>
+        <w:spacing w:after="120"/>
+      </w:pPr>
+      <w:r>
+        <w:rPr>
+          <w:color w:val="1E1D1C"/>
+        </w:rPr>
+        <w:t>There is also a clock on the output side. The vertical SaaS platforms will ship native AI surfaces inside the next eighteen months. Whoever owns the trades-fluent-AI category by then has the moat for the decade. The four steps above are a race against both clocks.</w:t>
       </w:r>
     </w:p>
     <w:p>

</xml_diff>